<commit_message>
[SDP] Create the SDP doc
</commit_message>
<xml_diff>
--- a/docs/do178/PSAC_I-SCEET.docx
+++ b/docs/do178/PSAC_I-SCEET.docx
@@ -463,15 +463,7 @@
                 <w:sz w:val="20"/>
                 <w:szCs w:val="20"/>
               </w:rPr>
-              <w:t>Hatem A</w:t>
-            </w:r>
-            <w:r>
-              <w:rPr>
-                <w:rFonts w:eastAsia="Arial" w:cs="Arial"/>
-                <w:sz w:val="20"/>
-                <w:szCs w:val="20"/>
-              </w:rPr>
-              <w:t>DOUANI</w:t>
+              <w:t>Hatem ADOUANI</w:t>
             </w:r>
           </w:p>
         </w:tc>
@@ -3373,7 +3365,14 @@
         </w:rPr>
       </w:pPr>
       <w:r>
-        <w:rPr/>
+        <w:rPr>
+          <w:rFonts w:eastAsia="Arial" w:cs="Arial" w:ascii="Arial" w:hAnsi="Arial"/>
+          <w:b/>
+          <w:bCs/>
+          <w:color w:val="1F3864"/>
+          <w:sz w:val="28"/>
+          <w:szCs w:val="28"/>
+        </w:rPr>
       </w:r>
       <w:r>
         <w:br w:type="page"/>
@@ -7621,8 +7620,8 @@
         </w:tblCellMar>
       </w:tblPr>
       <w:tblGrid>
-        <w:gridCol w:w="997"/>
-        <w:gridCol w:w="1802"/>
+        <w:gridCol w:w="996"/>
+        <w:gridCol w:w="1803"/>
         <w:gridCol w:w="2201"/>
         <w:gridCol w:w="4359"/>
       </w:tblGrid>
@@ -7632,7 +7631,7 @@
         </w:trPr>
         <w:tc>
           <w:tcPr>
-            <w:tcW w:w="997" w:type="dxa"/>
+            <w:tcW w:w="996" w:type="dxa"/>
             <w:tcBorders>
               <w:top w:val="single" w:sz="2" w:space="0" w:color="BBBBBB"/>
               <w:left w:val="single" w:sz="2" w:space="0" w:color="BBBBBB"/>
@@ -7662,7 +7661,7 @@
         </w:tc>
         <w:tc>
           <w:tcPr>
-            <w:tcW w:w="1802" w:type="dxa"/>
+            <w:tcW w:w="1803" w:type="dxa"/>
             <w:tcBorders>
               <w:top w:val="single" w:sz="2" w:space="0" w:color="BBBBBB"/>
               <w:left w:val="single" w:sz="2" w:space="0" w:color="BBBBBB"/>
@@ -7755,7 +7754,7 @@
         <w:trPr/>
         <w:tc>
           <w:tcPr>
-            <w:tcW w:w="997" w:type="dxa"/>
+            <w:tcW w:w="996" w:type="dxa"/>
             <w:tcBorders>
               <w:top w:val="single" w:sz="2" w:space="0" w:color="BBBBBB"/>
               <w:left w:val="single" w:sz="2" w:space="0" w:color="BBBBBB"/>
@@ -7782,7 +7781,7 @@
         </w:tc>
         <w:tc>
           <w:tcPr>
-            <w:tcW w:w="1802" w:type="dxa"/>
+            <w:tcW w:w="1803" w:type="dxa"/>
             <w:tcBorders>
               <w:top w:val="single" w:sz="2" w:space="0" w:color="BBBBBB"/>
               <w:left w:val="single" w:sz="2" w:space="0" w:color="BBBBBB"/>
@@ -7866,7 +7865,7 @@
         <w:trPr/>
         <w:tc>
           <w:tcPr>
-            <w:tcW w:w="997" w:type="dxa"/>
+            <w:tcW w:w="996" w:type="dxa"/>
             <w:tcBorders>
               <w:top w:val="single" w:sz="2" w:space="0" w:color="BBBBBB"/>
               <w:left w:val="single" w:sz="2" w:space="0" w:color="BBBBBB"/>
@@ -7893,7 +7892,7 @@
         </w:tc>
         <w:tc>
           <w:tcPr>
-            <w:tcW w:w="1802" w:type="dxa"/>
+            <w:tcW w:w="1803" w:type="dxa"/>
             <w:tcBorders>
               <w:top w:val="single" w:sz="2" w:space="0" w:color="BBBBBB"/>
               <w:left w:val="single" w:sz="2" w:space="0" w:color="BBBBBB"/>
@@ -7977,7 +7976,7 @@
         <w:trPr/>
         <w:tc>
           <w:tcPr>
-            <w:tcW w:w="997" w:type="dxa"/>
+            <w:tcW w:w="996" w:type="dxa"/>
             <w:tcBorders>
               <w:top w:val="single" w:sz="2" w:space="0" w:color="BBBBBB"/>
               <w:left w:val="single" w:sz="2" w:space="0" w:color="BBBBBB"/>
@@ -8004,7 +8003,7 @@
         </w:tc>
         <w:tc>
           <w:tcPr>
-            <w:tcW w:w="1802" w:type="dxa"/>
+            <w:tcW w:w="1803" w:type="dxa"/>
             <w:tcBorders>
               <w:top w:val="single" w:sz="2" w:space="0" w:color="BBBBBB"/>
               <w:left w:val="single" w:sz="2" w:space="0" w:color="BBBBBB"/>
@@ -8088,7 +8087,7 @@
         <w:trPr/>
         <w:tc>
           <w:tcPr>
-            <w:tcW w:w="997" w:type="dxa"/>
+            <w:tcW w:w="996" w:type="dxa"/>
             <w:tcBorders>
               <w:top w:val="single" w:sz="2" w:space="0" w:color="BBBBBB"/>
               <w:left w:val="single" w:sz="2" w:space="0" w:color="BBBBBB"/>
@@ -8115,7 +8114,7 @@
         </w:tc>
         <w:tc>
           <w:tcPr>
-            <w:tcW w:w="1802" w:type="dxa"/>
+            <w:tcW w:w="1803" w:type="dxa"/>
             <w:tcBorders>
               <w:top w:val="single" w:sz="2" w:space="0" w:color="BBBBBB"/>
               <w:left w:val="single" w:sz="2" w:space="0" w:color="BBBBBB"/>

</xml_diff>

<commit_message>
[PSAC] Update PSAC to the v2.0 version
</commit_message>
<xml_diff>
--- a/docs/do178/PSAC_I-SCEET.docx
+++ b/docs/do178/PSAC_I-SCEET.docx
@@ -292,7 +292,15 @@
                 <w:sz w:val="20"/>
                 <w:szCs w:val="20"/>
               </w:rPr>
-              <w:t>1.0</w:t>
+              <w:t>2</w:t>
+            </w:r>
+            <w:r>
+              <w:rPr>
+                <w:rFonts w:eastAsia="Arial" w:cs="Arial"/>
+                <w:sz w:val="20"/>
+                <w:szCs w:val="20"/>
+              </w:rPr>
+              <w:t>.0</w:t>
             </w:r>
           </w:p>
         </w:tc>
@@ -406,7 +414,31 @@
                 <w:sz w:val="20"/>
                 <w:szCs w:val="20"/>
               </w:rPr>
-              <w:t>2026-03-15</w:t>
+              <w:t>2026-0</w:t>
+            </w:r>
+            <w:r>
+              <w:rPr>
+                <w:rFonts w:eastAsia="Arial" w:cs="Arial"/>
+                <w:sz w:val="20"/>
+                <w:szCs w:val="20"/>
+              </w:rPr>
+              <w:t>4</w:t>
+            </w:r>
+            <w:r>
+              <w:rPr>
+                <w:rFonts w:eastAsia="Arial" w:cs="Arial"/>
+                <w:sz w:val="20"/>
+                <w:szCs w:val="20"/>
+              </w:rPr>
+              <w:t>-1</w:t>
+            </w:r>
+            <w:r>
+              <w:rPr>
+                <w:rFonts w:eastAsia="Arial" w:cs="Arial"/>
+                <w:sz w:val="20"/>
+                <w:szCs w:val="20"/>
+              </w:rPr>
+              <w:t>9</w:t>
             </w:r>
           </w:p>
         </w:tc>
@@ -1020,7 +1052,15 @@
                 <w:sz w:val="20"/>
                 <w:szCs w:val="20"/>
               </w:rPr>
-              <w:t>Hatem Adouani</w:t>
+              <w:t>Hatem A</w:t>
+            </w:r>
+            <w:r>
+              <w:rPr>
+                <w:rFonts w:eastAsia="Arial" w:cs="Arial"/>
+                <w:sz w:val="20"/>
+                <w:szCs w:val="20"/>
+              </w:rPr>
+              <w:t>DOUANI</w:t>
             </w:r>
           </w:p>
         </w:tc>
@@ -1047,7 +1087,7 @@
                 <w:sz w:val="20"/>
                 <w:szCs w:val="20"/>
               </w:rPr>
-              <w:t>Initial draft — project kickoff</w:t>
+              <w:t xml:space="preserve">Initial draft </w:t>
             </w:r>
           </w:p>
         </w:tc>
@@ -1069,10 +1109,25 @@
             <w:pPr>
               <w:pStyle w:val="Normal"/>
               <w:widowControl w:val="false"/>
-              <w:rPr/>
-            </w:pPr>
-            <w:r>
-              <w:rPr/>
+              <w:rPr>
+                <w:rFonts w:ascii="Arial" w:hAnsi="Arial" w:eastAsia="Arial" w:cs="Arial"/>
+                <w:color w:val="auto"/>
+                <w:kern w:val="0"/>
+                <w:sz w:val="20"/>
+                <w:szCs w:val="20"/>
+                <w:lang w:val="en-US" w:eastAsia="zh-CN" w:bidi="hi-IN"/>
+              </w:rPr>
+            </w:pPr>
+            <w:r>
+              <w:rPr>
+                <w:rFonts w:eastAsia="Arial" w:cs="Arial"/>
+                <w:color w:val="auto"/>
+                <w:kern w:val="0"/>
+                <w:sz w:val="20"/>
+                <w:szCs w:val="20"/>
+                <w:lang w:val="en-US" w:eastAsia="zh-CN" w:bidi="hi-IN"/>
+              </w:rPr>
+              <w:t>2.0</w:t>
             </w:r>
           </w:p>
         </w:tc>
@@ -1091,10 +1146,25 @@
             <w:pPr>
               <w:pStyle w:val="Normal"/>
               <w:widowControl w:val="false"/>
-              <w:rPr/>
-            </w:pPr>
-            <w:r>
-              <w:rPr/>
+              <w:rPr>
+                <w:rFonts w:ascii="Arial" w:hAnsi="Arial" w:eastAsia="Arial" w:cs="Arial"/>
+                <w:color w:val="auto"/>
+                <w:kern w:val="0"/>
+                <w:sz w:val="20"/>
+                <w:szCs w:val="20"/>
+                <w:lang w:val="en-US" w:eastAsia="zh-CN" w:bidi="hi-IN"/>
+              </w:rPr>
+            </w:pPr>
+            <w:r>
+              <w:rPr>
+                <w:rFonts w:eastAsia="Arial" w:cs="Arial"/>
+                <w:color w:val="auto"/>
+                <w:kern w:val="0"/>
+                <w:sz w:val="20"/>
+                <w:szCs w:val="20"/>
+                <w:lang w:val="en-US" w:eastAsia="zh-CN" w:bidi="hi-IN"/>
+              </w:rPr>
+              <w:t>2026-04-19</w:t>
             </w:r>
           </w:p>
         </w:tc>
@@ -1113,10 +1183,25 @@
             <w:pPr>
               <w:pStyle w:val="Normal"/>
               <w:widowControl w:val="false"/>
-              <w:rPr/>
-            </w:pPr>
-            <w:r>
-              <w:rPr/>
+              <w:rPr>
+                <w:rFonts w:ascii="Arial" w:hAnsi="Arial" w:eastAsia="Arial" w:cs="Arial"/>
+                <w:color w:val="auto"/>
+                <w:kern w:val="0"/>
+                <w:sz w:val="20"/>
+                <w:szCs w:val="20"/>
+                <w:lang w:val="en-US" w:eastAsia="zh-CN" w:bidi="hi-IN"/>
+              </w:rPr>
+            </w:pPr>
+            <w:r>
+              <w:rPr>
+                <w:rFonts w:eastAsia="Arial" w:cs="Arial"/>
+                <w:color w:val="auto"/>
+                <w:kern w:val="0"/>
+                <w:sz w:val="20"/>
+                <w:szCs w:val="20"/>
+                <w:lang w:val="en-US" w:eastAsia="zh-CN" w:bidi="hi-IN"/>
+              </w:rPr>
+              <w:t>Hatem ADOUANI</w:t>
             </w:r>
           </w:p>
         </w:tc>
@@ -1135,10 +1220,100 @@
             <w:pPr>
               <w:pStyle w:val="Normal"/>
               <w:widowControl w:val="false"/>
-              <w:rPr/>
-            </w:pPr>
-            <w:r>
-              <w:rPr/>
+              <w:rPr>
+                <w:rFonts w:ascii="Arial" w:hAnsi="Arial" w:eastAsia="Arial" w:cs="Arial"/>
+                <w:color w:val="auto"/>
+                <w:kern w:val="0"/>
+                <w:sz w:val="20"/>
+                <w:szCs w:val="20"/>
+                <w:lang w:val="en-US" w:eastAsia="zh-CN" w:bidi="hi-IN"/>
+              </w:rPr>
+            </w:pPr>
+            <w:r>
+              <w:rPr>
+                <w:rFonts w:eastAsia="Arial" w:cs="Arial"/>
+                <w:color w:val="auto"/>
+                <w:kern w:val="0"/>
+                <w:sz w:val="20"/>
+                <w:szCs w:val="20"/>
+                <w:lang w:val="en-US" w:eastAsia="zh-CN" w:bidi="hi-IN"/>
+              </w:rPr>
+              <w:t>Updated M1-M6 architecture: SRD-001,</w:t>
+            </w:r>
+          </w:p>
+          <w:p>
+            <w:pPr>
+              <w:pStyle w:val="Normal"/>
+              <w:widowControl w:val="false"/>
+              <w:rPr>
+                <w:rFonts w:ascii="Arial" w:hAnsi="Arial" w:eastAsia="Arial" w:cs="Arial"/>
+                <w:color w:val="auto"/>
+                <w:kern w:val="0"/>
+                <w:sz w:val="20"/>
+                <w:szCs w:val="20"/>
+                <w:lang w:val="en-US" w:eastAsia="zh-CN" w:bidi="hi-IN"/>
+              </w:rPr>
+            </w:pPr>
+            <w:r>
+              <w:rPr>
+                <w:rFonts w:eastAsia="Arial" w:cs="Arial"/>
+                <w:color w:val="auto"/>
+                <w:kern w:val="0"/>
+                <w:sz w:val="20"/>
+                <w:szCs w:val="20"/>
+                <w:lang w:val="en-US" w:eastAsia="zh-CN" w:bidi="hi-IN"/>
+              </w:rPr>
+              <w:t>SDDD-001, /src folder; corrected M4/M5</w:t>
+            </w:r>
+          </w:p>
+          <w:p>
+            <w:pPr>
+              <w:pStyle w:val="Normal"/>
+              <w:widowControl w:val="false"/>
+              <w:rPr>
+                <w:rFonts w:ascii="Arial" w:hAnsi="Arial" w:eastAsia="Arial" w:cs="Arial"/>
+                <w:color w:val="auto"/>
+                <w:kern w:val="0"/>
+                <w:sz w:val="20"/>
+                <w:szCs w:val="20"/>
+                <w:lang w:val="en-US" w:eastAsia="zh-CN" w:bidi="hi-IN"/>
+              </w:rPr>
+            </w:pPr>
+            <w:r>
+              <w:rPr>
+                <w:rFonts w:eastAsia="Arial" w:cs="Arial"/>
+                <w:color w:val="auto"/>
+                <w:kern w:val="0"/>
+                <w:sz w:val="20"/>
+                <w:szCs w:val="20"/>
+                <w:lang w:val="en-US" w:eastAsia="zh-CN" w:bidi="hi-IN"/>
+              </w:rPr>
+              <w:t>input sources; aligned standards</w:t>
+            </w:r>
+          </w:p>
+          <w:p>
+            <w:pPr>
+              <w:pStyle w:val="Normal"/>
+              <w:widowControl w:val="false"/>
+              <w:rPr>
+                <w:rFonts w:ascii="Arial" w:hAnsi="Arial" w:eastAsia="Arial" w:cs="Arial"/>
+                <w:color w:val="auto"/>
+                <w:kern w:val="0"/>
+                <w:sz w:val="20"/>
+                <w:szCs w:val="20"/>
+                <w:lang w:val="en-US" w:eastAsia="zh-CN" w:bidi="hi-IN"/>
+              </w:rPr>
+            </w:pPr>
+            <w:r>
+              <w:rPr>
+                <w:rFonts w:eastAsia="Arial" w:cs="Arial"/>
+                <w:color w:val="auto"/>
+                <w:kern w:val="0"/>
+                <w:sz w:val="20"/>
+                <w:szCs w:val="20"/>
+                <w:lang w:val="en-US" w:eastAsia="zh-CN" w:bidi="hi-IN"/>
+              </w:rPr>
+              <w:t>documents SRS/SDS/SCS</w:t>
             </w:r>
           </w:p>
         </w:tc>
@@ -1351,7 +1526,7 @@
           <w:sz w:val="22"/>
           <w:szCs w:val="22"/>
         </w:rPr>
-        <w:t>The project consists of an AI-powered toolchain composed of six intelligent modules (M1 to M6), each automating a specific phase of the DO-178C software development lifecycle:</w:t>
+        <w:t>The project consists of an AI-powered toolchain composed of six intelligent modules (M1 to M6), each automating a specific phase of the DO-178C software development lifecycle. Each module receives verified inputs and produces standardized lifecycle output documents:</w:t>
       </w:r>
     </w:p>
     <w:p>
@@ -1378,11 +1553,12 @@
         </w:tblCellMar>
       </w:tblPr>
       <w:tblGrid>
-        <w:gridCol w:w="900"/>
-        <w:gridCol w:w="2000"/>
-        <w:gridCol w:w="2197"/>
-        <w:gridCol w:w="2202"/>
-        <w:gridCol w:w="1061"/>
+        <w:gridCol w:w="600"/>
+        <w:gridCol w:w="1399"/>
+        <w:gridCol w:w="1600"/>
+        <w:gridCol w:w="1401"/>
+        <w:gridCol w:w="2400"/>
+        <w:gridCol w:w="959"/>
       </w:tblGrid>
       <w:tr>
         <w:trPr>
@@ -1390,7 +1566,7 @@
         </w:trPr>
         <w:tc>
           <w:tcPr>
-            <w:tcW w:w="900" w:type="dxa"/>
+            <w:tcW w:w="600" w:type="dxa"/>
             <w:tcBorders>
               <w:top w:val="single" w:sz="2" w:space="0" w:color="BBBBBB"/>
               <w:left w:val="single" w:sz="2" w:space="0" w:color="BBBBBB"/>
@@ -1420,7 +1596,7 @@
         </w:tc>
         <w:tc>
           <w:tcPr>
-            <w:tcW w:w="2000" w:type="dxa"/>
+            <w:tcW w:w="1399" w:type="dxa"/>
             <w:tcBorders>
               <w:top w:val="single" w:sz="2" w:space="0" w:color="BBBBBB"/>
               <w:left w:val="single" w:sz="2" w:space="0" w:color="BBBBBB"/>
@@ -1450,7 +1626,7 @@
         </w:tc>
         <w:tc>
           <w:tcPr>
-            <w:tcW w:w="2197" w:type="dxa"/>
+            <w:tcW w:w="1600" w:type="dxa"/>
             <w:tcBorders>
               <w:top w:val="single" w:sz="2" w:space="0" w:color="BBBBBB"/>
               <w:left w:val="single" w:sz="2" w:space="0" w:color="BBBBBB"/>
@@ -1480,7 +1656,7 @@
         </w:tc>
         <w:tc>
           <w:tcPr>
-            <w:tcW w:w="2202" w:type="dxa"/>
+            <w:tcW w:w="1401" w:type="dxa"/>
             <w:tcBorders>
               <w:top w:val="single" w:sz="2" w:space="0" w:color="BBBBBB"/>
               <w:left w:val="single" w:sz="2" w:space="0" w:color="BBBBBB"/>
@@ -1504,13 +1680,13 @@
                 <w:sz w:val="20"/>
                 <w:szCs w:val="20"/>
               </w:rPr>
-              <w:t>Output</w:t>
-            </w:r>
-          </w:p>
-        </w:tc>
-        <w:tc>
-          <w:tcPr>
-            <w:tcW w:w="1061" w:type="dxa"/>
+              <w:t>Output Document</w:t>
+            </w:r>
+          </w:p>
+        </w:tc>
+        <w:tc>
+          <w:tcPr>
+            <w:tcW w:w="2400" w:type="dxa"/>
             <w:tcBorders>
               <w:top w:val="single" w:sz="2" w:space="0" w:color="BBBBBB"/>
               <w:left w:val="single" w:sz="2" w:space="0" w:color="BBBBBB"/>
@@ -1534,6 +1710,36 @@
                 <w:sz w:val="20"/>
                 <w:szCs w:val="20"/>
               </w:rPr>
+              <w:t>Output Content</w:t>
+            </w:r>
+          </w:p>
+        </w:tc>
+        <w:tc>
+          <w:tcPr>
+            <w:tcW w:w="959" w:type="dxa"/>
+            <w:tcBorders>
+              <w:top w:val="single" w:sz="2" w:space="0" w:color="BBBBBB"/>
+              <w:left w:val="single" w:sz="2" w:space="0" w:color="BBBBBB"/>
+              <w:bottom w:val="single" w:sz="2" w:space="0" w:color="BBBBBB"/>
+              <w:right w:val="single" w:sz="2" w:space="0" w:color="BBBBBB"/>
+            </w:tcBorders>
+            <w:shd w:fill="1F3864" w:val="clear"/>
+          </w:tcPr>
+          <w:p>
+            <w:pPr>
+              <w:pStyle w:val="Normal"/>
+              <w:widowControl w:val="false"/>
+              <w:rPr/>
+            </w:pPr>
+            <w:r>
+              <w:rPr>
+                <w:rFonts w:eastAsia="Arial" w:cs="Arial"/>
+                <w:b/>
+                <w:bCs/>
+                <w:color w:val="FFFFFF"/>
+                <w:sz w:val="20"/>
+                <w:szCs w:val="20"/>
+              </w:rPr>
               <w:t>DO-178C §</w:t>
             </w:r>
           </w:p>
@@ -1543,7 +1749,7 @@
         <w:trPr/>
         <w:tc>
           <w:tcPr>
-            <w:tcW w:w="900" w:type="dxa"/>
+            <w:tcW w:w="600" w:type="dxa"/>
             <w:tcBorders>
               <w:top w:val="single" w:sz="2" w:space="0" w:color="BBBBBB"/>
               <w:left w:val="single" w:sz="2" w:space="0" w:color="BBBBBB"/>
@@ -1570,7 +1776,7 @@
         </w:tc>
         <w:tc>
           <w:tcPr>
-            <w:tcW w:w="2000" w:type="dxa"/>
+            <w:tcW w:w="1399" w:type="dxa"/>
             <w:tcBorders>
               <w:top w:val="single" w:sz="2" w:space="0" w:color="BBBBBB"/>
               <w:left w:val="single" w:sz="2" w:space="0" w:color="BBBBBB"/>
@@ -1597,7 +1803,7 @@
         </w:tc>
         <w:tc>
           <w:tcPr>
-            <w:tcW w:w="2197" w:type="dxa"/>
+            <w:tcW w:w="1600" w:type="dxa"/>
             <w:tcBorders>
               <w:top w:val="single" w:sz="2" w:space="0" w:color="BBBBBB"/>
               <w:left w:val="single" w:sz="2" w:space="0" w:color="BBBBBB"/>
@@ -1624,7 +1830,7 @@
         </w:tc>
         <w:tc>
           <w:tcPr>
-            <w:tcW w:w="2202" w:type="dxa"/>
+            <w:tcW w:w="1401" w:type="dxa"/>
             <w:tcBorders>
               <w:top w:val="single" w:sz="2" w:space="0" w:color="BBBBBB"/>
               <w:left w:val="single" w:sz="2" w:space="0" w:color="BBBBBB"/>
@@ -1645,13 +1851,40 @@
                 <w:sz w:val="20"/>
                 <w:szCs w:val="20"/>
               </w:rPr>
-              <w:t>High Level Requirements (HLR)</w:t>
-            </w:r>
-          </w:p>
-        </w:tc>
-        <w:tc>
-          <w:tcPr>
-            <w:tcW w:w="1061" w:type="dxa"/>
+              <w:t>SRD-001</w:t>
+            </w:r>
+          </w:p>
+        </w:tc>
+        <w:tc>
+          <w:tcPr>
+            <w:tcW w:w="2400" w:type="dxa"/>
+            <w:tcBorders>
+              <w:top w:val="single" w:sz="2" w:space="0" w:color="BBBBBB"/>
+              <w:left w:val="single" w:sz="2" w:space="0" w:color="BBBBBB"/>
+              <w:bottom w:val="single" w:sz="2" w:space="0" w:color="BBBBBB"/>
+              <w:right w:val="single" w:sz="2" w:space="0" w:color="BBBBBB"/>
+            </w:tcBorders>
+            <w:shd w:fill="F2F2F2" w:val="clear"/>
+          </w:tcPr>
+          <w:p>
+            <w:pPr>
+              <w:pStyle w:val="Normal"/>
+              <w:widowControl w:val="false"/>
+              <w:rPr/>
+            </w:pPr>
+            <w:r>
+              <w:rPr>
+                <w:rFonts w:eastAsia="Arial" w:cs="Arial"/>
+                <w:sz w:val="20"/>
+                <w:szCs w:val="20"/>
+              </w:rPr>
+              <w:t>Section 1: System Architecture (user-provided) Section 2: HLR-001...HLR-0xx</w:t>
+            </w:r>
+          </w:p>
+        </w:tc>
+        <w:tc>
+          <w:tcPr>
+            <w:tcW w:w="959" w:type="dxa"/>
             <w:tcBorders>
               <w:top w:val="single" w:sz="2" w:space="0" w:color="BBBBBB"/>
               <w:left w:val="single" w:sz="2" w:space="0" w:color="BBBBBB"/>
@@ -1681,7 +1914,7 @@
         <w:trPr/>
         <w:tc>
           <w:tcPr>
-            <w:tcW w:w="900" w:type="dxa"/>
+            <w:tcW w:w="600" w:type="dxa"/>
             <w:tcBorders>
               <w:top w:val="single" w:sz="2" w:space="0" w:color="BBBBBB"/>
               <w:left w:val="single" w:sz="2" w:space="0" w:color="BBBBBB"/>
@@ -1708,7 +1941,7 @@
         </w:tc>
         <w:tc>
           <w:tcPr>
-            <w:tcW w:w="2000" w:type="dxa"/>
+            <w:tcW w:w="1399" w:type="dxa"/>
             <w:tcBorders>
               <w:top w:val="single" w:sz="2" w:space="0" w:color="BBBBBB"/>
               <w:left w:val="single" w:sz="2" w:space="0" w:color="BBBBBB"/>
@@ -1735,7 +1968,7 @@
         </w:tc>
         <w:tc>
           <w:tcPr>
-            <w:tcW w:w="2197" w:type="dxa"/>
+            <w:tcW w:w="1600" w:type="dxa"/>
             <w:tcBorders>
               <w:top w:val="single" w:sz="2" w:space="0" w:color="BBBBBB"/>
               <w:left w:val="single" w:sz="2" w:space="0" w:color="BBBBBB"/>
@@ -1756,13 +1989,13 @@
                 <w:sz w:val="20"/>
                 <w:szCs w:val="20"/>
               </w:rPr>
-              <w:t>HLR</w:t>
-            </w:r>
-          </w:p>
-        </w:tc>
-        <w:tc>
-          <w:tcPr>
-            <w:tcW w:w="2202" w:type="dxa"/>
+              <w:t>SRD-001 (HLRs)</w:t>
+            </w:r>
+          </w:p>
+        </w:tc>
+        <w:tc>
+          <w:tcPr>
+            <w:tcW w:w="1401" w:type="dxa"/>
             <w:tcBorders>
               <w:top w:val="single" w:sz="2" w:space="0" w:color="BBBBBB"/>
               <w:left w:val="single" w:sz="2" w:space="0" w:color="BBBBBB"/>
@@ -1783,13 +2016,40 @@
                 <w:sz w:val="20"/>
                 <w:szCs w:val="20"/>
               </w:rPr>
-              <w:t>Low Level Requirements (LLR)</w:t>
-            </w:r>
-          </w:p>
-        </w:tc>
-        <w:tc>
-          <w:tcPr>
-            <w:tcW w:w="1061" w:type="dxa"/>
+              <w:t>SDDD-001</w:t>
+            </w:r>
+          </w:p>
+        </w:tc>
+        <w:tc>
+          <w:tcPr>
+            <w:tcW w:w="2400" w:type="dxa"/>
+            <w:tcBorders>
+              <w:top w:val="single" w:sz="2" w:space="0" w:color="BBBBBB"/>
+              <w:left w:val="single" w:sz="2" w:space="0" w:color="BBBBBB"/>
+              <w:bottom w:val="single" w:sz="2" w:space="0" w:color="BBBBBB"/>
+              <w:right w:val="single" w:sz="2" w:space="0" w:color="BBBBBB"/>
+            </w:tcBorders>
+            <w:shd w:fill="FFFFFF" w:val="clear"/>
+          </w:tcPr>
+          <w:p>
+            <w:pPr>
+              <w:pStyle w:val="Normal"/>
+              <w:widowControl w:val="false"/>
+              <w:rPr/>
+            </w:pPr>
+            <w:r>
+              <w:rPr>
+                <w:rFonts w:eastAsia="Arial" w:cs="Arial"/>
+                <w:sz w:val="20"/>
+                <w:szCs w:val="20"/>
+              </w:rPr>
+              <w:t>Section 1: Software Architecture (generated) Section 2: LLR-001...LLR-0xx</w:t>
+            </w:r>
+          </w:p>
+        </w:tc>
+        <w:tc>
+          <w:tcPr>
+            <w:tcW w:w="959" w:type="dxa"/>
             <w:tcBorders>
               <w:top w:val="single" w:sz="2" w:space="0" w:color="BBBBBB"/>
               <w:left w:val="single" w:sz="2" w:space="0" w:color="BBBBBB"/>
@@ -1819,7 +2079,7 @@
         <w:trPr/>
         <w:tc>
           <w:tcPr>
-            <w:tcW w:w="900" w:type="dxa"/>
+            <w:tcW w:w="600" w:type="dxa"/>
             <w:tcBorders>
               <w:top w:val="single" w:sz="2" w:space="0" w:color="BBBBBB"/>
               <w:left w:val="single" w:sz="2" w:space="0" w:color="BBBBBB"/>
@@ -1846,7 +2106,7 @@
         </w:tc>
         <w:tc>
           <w:tcPr>
-            <w:tcW w:w="2000" w:type="dxa"/>
+            <w:tcW w:w="1399" w:type="dxa"/>
             <w:tcBorders>
               <w:top w:val="single" w:sz="2" w:space="0" w:color="BBBBBB"/>
               <w:left w:val="single" w:sz="2" w:space="0" w:color="BBBBBB"/>
@@ -1873,7 +2133,7 @@
         </w:tc>
         <w:tc>
           <w:tcPr>
-            <w:tcW w:w="2197" w:type="dxa"/>
+            <w:tcW w:w="1600" w:type="dxa"/>
             <w:tcBorders>
               <w:top w:val="single" w:sz="2" w:space="0" w:color="BBBBBB"/>
               <w:left w:val="single" w:sz="2" w:space="0" w:color="BBBBBB"/>
@@ -1894,13 +2154,13 @@
                 <w:sz w:val="20"/>
                 <w:szCs w:val="20"/>
               </w:rPr>
-              <w:t>LLR</w:t>
-            </w:r>
-          </w:p>
-        </w:tc>
-        <w:tc>
-          <w:tcPr>
-            <w:tcW w:w="2202" w:type="dxa"/>
+              <w:t>SDDD-001 (LLRs)</w:t>
+            </w:r>
+          </w:p>
+        </w:tc>
+        <w:tc>
+          <w:tcPr>
+            <w:tcW w:w="1401" w:type="dxa"/>
             <w:tcBorders>
               <w:top w:val="single" w:sz="2" w:space="0" w:color="BBBBBB"/>
               <w:left w:val="single" w:sz="2" w:space="0" w:color="BBBBBB"/>
@@ -1921,13 +2181,40 @@
                 <w:sz w:val="20"/>
                 <w:szCs w:val="20"/>
               </w:rPr>
-              <w:t>Source Code</w:t>
-            </w:r>
-          </w:p>
-        </w:tc>
-        <w:tc>
-          <w:tcPr>
-            <w:tcW w:w="1061" w:type="dxa"/>
+              <w:t>/src folder</w:t>
+            </w:r>
+          </w:p>
+        </w:tc>
+        <w:tc>
+          <w:tcPr>
+            <w:tcW w:w="2400" w:type="dxa"/>
+            <w:tcBorders>
+              <w:top w:val="single" w:sz="2" w:space="0" w:color="BBBBBB"/>
+              <w:left w:val="single" w:sz="2" w:space="0" w:color="BBBBBB"/>
+              <w:bottom w:val="single" w:sz="2" w:space="0" w:color="BBBBBB"/>
+              <w:right w:val="single" w:sz="2" w:space="0" w:color="BBBBBB"/>
+            </w:tcBorders>
+            <w:shd w:fill="F2F2F2" w:val="clear"/>
+          </w:tcPr>
+          <w:p>
+            <w:pPr>
+              <w:pStyle w:val="Normal"/>
+              <w:widowControl w:val="false"/>
+              <w:rPr/>
+            </w:pPr>
+            <w:r>
+              <w:rPr>
+                <w:rFonts w:eastAsia="Arial" w:cs="Arial"/>
+                <w:sz w:val="20"/>
+                <w:szCs w:val="20"/>
+              </w:rPr>
+              <w:t>Structured source files, one per module, traceable to LLR-0xx</w:t>
+            </w:r>
+          </w:p>
+        </w:tc>
+        <w:tc>
+          <w:tcPr>
+            <w:tcW w:w="959" w:type="dxa"/>
             <w:tcBorders>
               <w:top w:val="single" w:sz="2" w:space="0" w:color="BBBBBB"/>
               <w:left w:val="single" w:sz="2" w:space="0" w:color="BBBBBB"/>
@@ -1957,7 +2244,7 @@
         <w:trPr/>
         <w:tc>
           <w:tcPr>
-            <w:tcW w:w="900" w:type="dxa"/>
+            <w:tcW w:w="600" w:type="dxa"/>
             <w:tcBorders>
               <w:top w:val="single" w:sz="2" w:space="0" w:color="BBBBBB"/>
               <w:left w:val="single" w:sz="2" w:space="0" w:color="BBBBBB"/>
@@ -1984,7 +2271,7 @@
         </w:tc>
         <w:tc>
           <w:tcPr>
-            <w:tcW w:w="2000" w:type="dxa"/>
+            <w:tcW w:w="1399" w:type="dxa"/>
             <w:tcBorders>
               <w:top w:val="single" w:sz="2" w:space="0" w:color="BBBBBB"/>
               <w:left w:val="single" w:sz="2" w:space="0" w:color="BBBBBB"/>
@@ -2011,7 +2298,7 @@
         </w:tc>
         <w:tc>
           <w:tcPr>
-            <w:tcW w:w="2197" w:type="dxa"/>
+            <w:tcW w:w="1600" w:type="dxa"/>
             <w:tcBorders>
               <w:top w:val="single" w:sz="2" w:space="0" w:color="BBBBBB"/>
               <w:left w:val="single" w:sz="2" w:space="0" w:color="BBBBBB"/>
@@ -2032,13 +2319,13 @@
                 <w:sz w:val="20"/>
                 <w:szCs w:val="20"/>
               </w:rPr>
-              <w:t>LLR</w:t>
-            </w:r>
-          </w:p>
-        </w:tc>
-        <w:tc>
-          <w:tcPr>
-            <w:tcW w:w="2202" w:type="dxa"/>
+              <w:t>SDDD-001 (LLRs)</w:t>
+            </w:r>
+          </w:p>
+        </w:tc>
+        <w:tc>
+          <w:tcPr>
+            <w:tcW w:w="1401" w:type="dxa"/>
             <w:tcBorders>
               <w:top w:val="single" w:sz="2" w:space="0" w:color="BBBBBB"/>
               <w:left w:val="single" w:sz="2" w:space="0" w:color="BBBBBB"/>
@@ -2059,13 +2346,40 @@
                 <w:sz w:val="20"/>
                 <w:szCs w:val="20"/>
               </w:rPr>
-              <w:t>Low Level Tests (LLT)</w:t>
-            </w:r>
-          </w:p>
-        </w:tc>
-        <w:tc>
-          <w:tcPr>
-            <w:tcW w:w="1061" w:type="dxa"/>
+              <w:t>SVCP-LLT-001</w:t>
+            </w:r>
+          </w:p>
+        </w:tc>
+        <w:tc>
+          <w:tcPr>
+            <w:tcW w:w="2400" w:type="dxa"/>
+            <w:tcBorders>
+              <w:top w:val="single" w:sz="2" w:space="0" w:color="BBBBBB"/>
+              <w:left w:val="single" w:sz="2" w:space="0" w:color="BBBBBB"/>
+              <w:bottom w:val="single" w:sz="2" w:space="0" w:color="BBBBBB"/>
+              <w:right w:val="single" w:sz="2" w:space="0" w:color="BBBBBB"/>
+            </w:tcBorders>
+            <w:shd w:fill="FFFFFF" w:val="clear"/>
+          </w:tcPr>
+          <w:p>
+            <w:pPr>
+              <w:pStyle w:val="Normal"/>
+              <w:widowControl w:val="false"/>
+              <w:rPr/>
+            </w:pPr>
+            <w:r>
+              <w:rPr>
+                <w:rFonts w:eastAsia="Arial" w:cs="Arial"/>
+                <w:sz w:val="20"/>
+                <w:szCs w:val="20"/>
+              </w:rPr>
+              <w:t>Low Level Test cases derived from LLRs</w:t>
+            </w:r>
+          </w:p>
+        </w:tc>
+        <w:tc>
+          <w:tcPr>
+            <w:tcW w:w="959" w:type="dxa"/>
             <w:tcBorders>
               <w:top w:val="single" w:sz="2" w:space="0" w:color="BBBBBB"/>
               <w:left w:val="single" w:sz="2" w:space="0" w:color="BBBBBB"/>
@@ -2095,7 +2409,7 @@
         <w:trPr/>
         <w:tc>
           <w:tcPr>
-            <w:tcW w:w="900" w:type="dxa"/>
+            <w:tcW w:w="600" w:type="dxa"/>
             <w:tcBorders>
               <w:top w:val="single" w:sz="2" w:space="0" w:color="BBBBBB"/>
               <w:left w:val="single" w:sz="2" w:space="0" w:color="BBBBBB"/>
@@ -2122,7 +2436,7 @@
         </w:tc>
         <w:tc>
           <w:tcPr>
-            <w:tcW w:w="2000" w:type="dxa"/>
+            <w:tcW w:w="1399" w:type="dxa"/>
             <w:tcBorders>
               <w:top w:val="single" w:sz="2" w:space="0" w:color="BBBBBB"/>
               <w:left w:val="single" w:sz="2" w:space="0" w:color="BBBBBB"/>
@@ -2149,7 +2463,7 @@
         </w:tc>
         <w:tc>
           <w:tcPr>
-            <w:tcW w:w="2197" w:type="dxa"/>
+            <w:tcW w:w="1600" w:type="dxa"/>
             <w:tcBorders>
               <w:top w:val="single" w:sz="2" w:space="0" w:color="BBBBBB"/>
               <w:left w:val="single" w:sz="2" w:space="0" w:color="BBBBBB"/>
@@ -2170,13 +2484,13 @@
                 <w:sz w:val="20"/>
                 <w:szCs w:val="20"/>
               </w:rPr>
-              <w:t>HLR</w:t>
-            </w:r>
-          </w:p>
-        </w:tc>
-        <w:tc>
-          <w:tcPr>
-            <w:tcW w:w="2202" w:type="dxa"/>
+              <w:t>SRD-001 (HLRs)</w:t>
+            </w:r>
+          </w:p>
+        </w:tc>
+        <w:tc>
+          <w:tcPr>
+            <w:tcW w:w="1401" w:type="dxa"/>
             <w:tcBorders>
               <w:top w:val="single" w:sz="2" w:space="0" w:color="BBBBBB"/>
               <w:left w:val="single" w:sz="2" w:space="0" w:color="BBBBBB"/>
@@ -2197,13 +2511,40 @@
                 <w:sz w:val="20"/>
                 <w:szCs w:val="20"/>
               </w:rPr>
-              <w:t>High Level Tests (HLT)</w:t>
-            </w:r>
-          </w:p>
-        </w:tc>
-        <w:tc>
-          <w:tcPr>
-            <w:tcW w:w="1061" w:type="dxa"/>
+              <w:t>SVCP-HLT-001</w:t>
+            </w:r>
+          </w:p>
+        </w:tc>
+        <w:tc>
+          <w:tcPr>
+            <w:tcW w:w="2400" w:type="dxa"/>
+            <w:tcBorders>
+              <w:top w:val="single" w:sz="2" w:space="0" w:color="BBBBBB"/>
+              <w:left w:val="single" w:sz="2" w:space="0" w:color="BBBBBB"/>
+              <w:bottom w:val="single" w:sz="2" w:space="0" w:color="BBBBBB"/>
+              <w:right w:val="single" w:sz="2" w:space="0" w:color="BBBBBB"/>
+            </w:tcBorders>
+            <w:shd w:fill="F2F2F2" w:val="clear"/>
+          </w:tcPr>
+          <w:p>
+            <w:pPr>
+              <w:pStyle w:val="Normal"/>
+              <w:widowControl w:val="false"/>
+              <w:rPr/>
+            </w:pPr>
+            <w:r>
+              <w:rPr>
+                <w:rFonts w:eastAsia="Arial" w:cs="Arial"/>
+                <w:sz w:val="20"/>
+                <w:szCs w:val="20"/>
+              </w:rPr>
+              <w:t>High Level Test cases derived from HLRs</w:t>
+            </w:r>
+          </w:p>
+        </w:tc>
+        <w:tc>
+          <w:tcPr>
+            <w:tcW w:w="959" w:type="dxa"/>
             <w:tcBorders>
               <w:top w:val="single" w:sz="2" w:space="0" w:color="BBBBBB"/>
               <w:left w:val="single" w:sz="2" w:space="0" w:color="BBBBBB"/>
@@ -2233,7 +2574,7 @@
         <w:trPr/>
         <w:tc>
           <w:tcPr>
-            <w:tcW w:w="900" w:type="dxa"/>
+            <w:tcW w:w="600" w:type="dxa"/>
             <w:tcBorders>
               <w:top w:val="single" w:sz="2" w:space="0" w:color="BBBBBB"/>
               <w:left w:val="single" w:sz="2" w:space="0" w:color="BBBBBB"/>
@@ -2260,7 +2601,7 @@
         </w:tc>
         <w:tc>
           <w:tcPr>
-            <w:tcW w:w="2000" w:type="dxa"/>
+            <w:tcW w:w="1399" w:type="dxa"/>
             <w:tcBorders>
               <w:top w:val="single" w:sz="2" w:space="0" w:color="BBBBBB"/>
               <w:left w:val="single" w:sz="2" w:space="0" w:color="BBBBBB"/>
@@ -2287,7 +2628,7 @@
         </w:tc>
         <w:tc>
           <w:tcPr>
-            <w:tcW w:w="2197" w:type="dxa"/>
+            <w:tcW w:w="1600" w:type="dxa"/>
             <w:tcBorders>
               <w:top w:val="single" w:sz="2" w:space="0" w:color="BBBBBB"/>
               <w:left w:val="single" w:sz="2" w:space="0" w:color="BBBBBB"/>
@@ -2314,7 +2655,7 @@
         </w:tc>
         <w:tc>
           <w:tcPr>
-            <w:tcW w:w="2202" w:type="dxa"/>
+            <w:tcW w:w="1401" w:type="dxa"/>
             <w:tcBorders>
               <w:top w:val="single" w:sz="2" w:space="0" w:color="BBBBBB"/>
               <w:left w:val="single" w:sz="2" w:space="0" w:color="BBBBBB"/>
@@ -2335,13 +2676,40 @@
                 <w:sz w:val="20"/>
                 <w:szCs w:val="20"/>
               </w:rPr>
-              <w:t>Traceability Matrix</w:t>
-            </w:r>
-          </w:p>
-        </w:tc>
-        <w:tc>
-          <w:tcPr>
-            <w:tcW w:w="1061" w:type="dxa"/>
+              <w:t>STD-001</w:t>
+            </w:r>
+          </w:p>
+        </w:tc>
+        <w:tc>
+          <w:tcPr>
+            <w:tcW w:w="2400" w:type="dxa"/>
+            <w:tcBorders>
+              <w:top w:val="single" w:sz="2" w:space="0" w:color="BBBBBB"/>
+              <w:left w:val="single" w:sz="2" w:space="0" w:color="BBBBBB"/>
+              <w:bottom w:val="single" w:sz="2" w:space="0" w:color="BBBBBB"/>
+              <w:right w:val="single" w:sz="2" w:space="0" w:color="BBBBBB"/>
+            </w:tcBorders>
+            <w:shd w:fill="FFFFFF" w:val="clear"/>
+          </w:tcPr>
+          <w:p>
+            <w:pPr>
+              <w:pStyle w:val="Normal"/>
+              <w:widowControl w:val="false"/>
+              <w:rPr/>
+            </w:pPr>
+            <w:r>
+              <w:rPr>
+                <w:rFonts w:eastAsia="Arial" w:cs="Arial"/>
+                <w:sz w:val="20"/>
+                <w:szCs w:val="20"/>
+              </w:rPr>
+              <w:t>Bidirectional traceability matrix: PDS-HLR-LLR-Code-LLT-HLT</w:t>
+            </w:r>
+          </w:p>
+        </w:tc>
+        <w:tc>
+          <w:tcPr>
+            <w:tcW w:w="959" w:type="dxa"/>
             <w:tcBorders>
               <w:top w:val="single" w:sz="2" w:space="0" w:color="BBBBBB"/>
               <w:left w:val="single" w:sz="2" w:space="0" w:color="BBBBBB"/>
@@ -2372,10 +2740,35 @@
       <w:pPr>
         <w:pStyle w:val="Normal"/>
         <w:spacing w:before="100" w:after="100"/>
-        <w:rPr/>
-      </w:pPr>
-      <w:r>
-        <w:rPr/>
+        <w:rPr>
+          <w:rFonts w:eastAsia="Arial" w:cs="Arial"/>
+          <w:sz w:val="22"/>
+          <w:szCs w:val="22"/>
+        </w:rPr>
+      </w:pPr>
+      <w:r>
+        <w:rPr/>
+      </w:r>
+    </w:p>
+    <w:p>
+      <w:pPr>
+        <w:pStyle w:val="Heading2"/>
+        <w:spacing w:before="300" w:after="150"/>
+        <w:rPr>
+          <w:rFonts w:ascii="Arial" w:hAnsi="Arial" w:eastAsia="Arial" w:cs="Arial"/>
+          <w:b/>
+          <w:b/>
+          <w:bCs/>
+          <w:color w:val="2E75B6"/>
+          <w:sz w:val="24"/>
+          <w:szCs w:val="24"/>
+        </w:rPr>
+      </w:pPr>
+      <w:r>
+        <w:rPr/>
+      </w:r>
+      <w:r>
+        <w:br w:type="page"/>
       </w:r>
     </w:p>
     <w:p>
@@ -2393,7 +2786,7 @@
           <w:sz w:val="24"/>
           <w:szCs w:val="24"/>
         </w:rPr>
-        <w:t>2.3 Scope</w:t>
+        <w:t>2.3 Key Architectural Decisions</w:t>
       </w:r>
     </w:p>
     <w:p>
@@ -2408,7 +2801,83 @@
           <w:sz w:val="22"/>
           <w:szCs w:val="22"/>
         </w:rPr>
-        <w:t>This PSAC covers all software lifecycle data produced by the toolchain, including requirements, design, code, tests, and traceability data. All AI-generated outputs are subject to human review and verification in accordance with DO-178C objectives.</w:t>
+        <w:t>The following architectural decisions govern the structure of lifecycle outputs:</w:t>
+      </w:r>
+    </w:p>
+    <w:p>
+      <w:pPr>
+        <w:pStyle w:val="ListParagraph"/>
+        <w:numPr>
+          <w:ilvl w:val="0"/>
+          <w:numId w:val="27"/>
+        </w:numPr>
+        <w:spacing w:before="60" w:after="60"/>
+        <w:rPr/>
+      </w:pPr>
+      <w:r>
+        <w:rPr>
+          <w:rFonts w:eastAsia="Arial" w:cs="Arial"/>
+          <w:sz w:val="22"/>
+          <w:szCs w:val="22"/>
+        </w:rPr>
+        <w:t>SRD-001 contains two sections: (1) the System Architecture provided by the engineer as M1 input context, and (2) the HLRs generated by M1. This ensures full traceability from system architecture to software requirements within a single document.</w:t>
+      </w:r>
+    </w:p>
+    <w:p>
+      <w:pPr>
+        <w:pStyle w:val="ListParagraph"/>
+        <w:numPr>
+          <w:ilvl w:val="0"/>
+          <w:numId w:val="1"/>
+        </w:numPr>
+        <w:spacing w:before="60" w:after="60"/>
+        <w:rPr/>
+      </w:pPr>
+      <w:r>
+        <w:rPr>
+          <w:rFonts w:eastAsia="Arial" w:cs="Arial"/>
+          <w:sz w:val="22"/>
+          <w:szCs w:val="22"/>
+        </w:rPr>
+        <w:t>SDDD-001 contains two sections: (1) the Software Architecture generated by M2 from HLRs, and (2) the LLRs derived from those HLRs. This co-location ensures design and requirements are always consistent.</w:t>
+      </w:r>
+    </w:p>
+    <w:p>
+      <w:pPr>
+        <w:pStyle w:val="ListParagraph"/>
+        <w:numPr>
+          <w:ilvl w:val="0"/>
+          <w:numId w:val="1"/>
+        </w:numPr>
+        <w:spacing w:before="60" w:after="60"/>
+        <w:rPr/>
+      </w:pPr>
+      <w:r>
+        <w:rPr>
+          <w:rFonts w:eastAsia="Arial" w:cs="Arial"/>
+          <w:sz w:val="22"/>
+          <w:szCs w:val="22"/>
+        </w:rPr>
+        <w:t>M3 generates source code into a structured /src folder, with one subfolder per functional module, each file explicitly traceable to one or more LLR identifiers.</w:t>
+      </w:r>
+    </w:p>
+    <w:p>
+      <w:pPr>
+        <w:pStyle w:val="ListParagraph"/>
+        <w:numPr>
+          <w:ilvl w:val="0"/>
+          <w:numId w:val="1"/>
+        </w:numPr>
+        <w:spacing w:before="60" w:after="60"/>
+        <w:rPr/>
+      </w:pPr>
+      <w:r>
+        <w:rPr>
+          <w:rFonts w:eastAsia="Arial" w:cs="Arial"/>
+          <w:sz w:val="22"/>
+          <w:szCs w:val="22"/>
+        </w:rPr>
+        <w:t>M4 reads exclusively from SDDD-001 (LLRs) to generate structural low-level tests. M5 reads exclusively from SRD-001 (HLRs) to generate functional high-level tests. These sources must not be mixed.</w:t>
       </w:r>
     </w:p>
     <w:p>
@@ -2436,7 +2905,50 @@
           <w:sz w:val="24"/>
           <w:szCs w:val="24"/>
         </w:rPr>
-        <w:t>2.4 Referenced Documents</w:t>
+        <w:t>2.4 Scope</w:t>
+      </w:r>
+    </w:p>
+    <w:p>
+      <w:pPr>
+        <w:pStyle w:val="Normal"/>
+        <w:spacing w:before="80" w:after="80"/>
+        <w:rPr/>
+      </w:pPr>
+      <w:r>
+        <w:rPr>
+          <w:rFonts w:eastAsia="Arial" w:cs="Arial"/>
+          <w:sz w:val="22"/>
+          <w:szCs w:val="22"/>
+        </w:rPr>
+        <w:t>This PSAC covers all software lifecycle data produced by the toolchain, including requirements, design, code, tests, and traceability data. All AI-generated outputs are subject to human review and verification in accordance with DO-178C objectives.</w:t>
+      </w:r>
+    </w:p>
+    <w:p>
+      <w:pPr>
+        <w:pStyle w:val="Normal"/>
+        <w:spacing w:before="100" w:after="100"/>
+        <w:rPr/>
+      </w:pPr>
+      <w:r>
+        <w:rPr/>
+      </w:r>
+    </w:p>
+    <w:p>
+      <w:pPr>
+        <w:pStyle w:val="Heading2"/>
+        <w:spacing w:before="300" w:after="150"/>
+        <w:rPr/>
+      </w:pPr>
+      <w:r>
+        <w:rPr>
+          <w:rFonts w:eastAsia="Arial" w:cs="Arial" w:ascii="Arial" w:hAnsi="Arial"/>
+          <w:b/>
+          <w:bCs/>
+          <w:color w:val="2E75B6"/>
+          <w:sz w:val="24"/>
+          <w:szCs w:val="24"/>
+        </w:rPr>
+        <w:t>2.5 Referenced Documents</w:t>
       </w:r>
     </w:p>
     <w:p>
@@ -2444,7 +2956,7 @@
         <w:pStyle w:val="ListParagraph"/>
         <w:numPr>
           <w:ilvl w:val="0"/>
-          <w:numId w:val="35"/>
+          <w:numId w:val="1"/>
         </w:numPr>
         <w:spacing w:before="60" w:after="60"/>
         <w:rPr/>
@@ -2463,7 +2975,7 @@
         <w:pStyle w:val="ListParagraph"/>
         <w:numPr>
           <w:ilvl w:val="0"/>
-          <w:numId w:val="36"/>
+          <w:numId w:val="1"/>
         </w:numPr>
         <w:spacing w:before="60" w:after="60"/>
         <w:rPr/>
@@ -2482,7 +2994,7 @@
         <w:pStyle w:val="ListParagraph"/>
         <w:numPr>
           <w:ilvl w:val="0"/>
-          <w:numId w:val="37"/>
+          <w:numId w:val="1"/>
         </w:numPr>
         <w:spacing w:before="60" w:after="60"/>
         <w:rPr/>
@@ -2501,7 +3013,7 @@
         <w:pStyle w:val="ListParagraph"/>
         <w:numPr>
           <w:ilvl w:val="0"/>
-          <w:numId w:val="38"/>
+          <w:numId w:val="1"/>
         </w:numPr>
         <w:spacing w:before="60" w:after="60"/>
         <w:rPr/>
@@ -2520,7 +3032,7 @@
         <w:pStyle w:val="ListParagraph"/>
         <w:numPr>
           <w:ilvl w:val="0"/>
-          <w:numId w:val="39"/>
+          <w:numId w:val="1"/>
         </w:numPr>
         <w:spacing w:before="60" w:after="60"/>
         <w:rPr/>
@@ -2538,7 +3050,15 @@
       <w:pPr>
         <w:pStyle w:val="Normal"/>
         <w:spacing w:before="100" w:after="100"/>
-        <w:rPr/>
+        <w:rPr>
+          <w:rFonts w:ascii="Arial" w:hAnsi="Arial" w:eastAsia="Arial" w:cs="Arial"/>
+          <w:b/>
+          <w:b/>
+          <w:bCs/>
+          <w:color w:val="2E75B6"/>
+          <w:sz w:val="24"/>
+          <w:szCs w:val="24"/>
+        </w:rPr>
       </w:pPr>
       <w:r>
         <w:rPr/>
@@ -2640,8 +3160,12 @@
     </w:p>
     <w:p>
       <w:pPr>
-        <w:pStyle w:val="Normal"/>
-        <w:spacing w:before="80" w:after="80"/>
+        <w:pStyle w:val="ListParagraph"/>
+        <w:numPr>
+          <w:ilvl w:val="0"/>
+          <w:numId w:val="1"/>
+        </w:numPr>
+        <w:spacing w:before="60" w:after="60"/>
         <w:rPr/>
       </w:pPr>
       <w:r>
@@ -2650,7 +3174,7 @@
           <w:sz w:val="22"/>
           <w:szCs w:val="22"/>
         </w:rPr>
-        <w:t>The primary software functions are:</w:t>
+        <w:t>M1: Parse PDS, hardware documentation, and user-provided system architecture to generate HLRs, producing SRD-001</w:t>
       </w:r>
     </w:p>
     <w:p>
@@ -2658,7 +3182,7 @@
         <w:pStyle w:val="ListParagraph"/>
         <w:numPr>
           <w:ilvl w:val="0"/>
-          <w:numId w:val="40"/>
+          <w:numId w:val="1"/>
         </w:numPr>
         <w:spacing w:before="60" w:after="60"/>
         <w:rPr/>
@@ -2669,7 +3193,7 @@
           <w:sz w:val="22"/>
           <w:szCs w:val="22"/>
         </w:rPr>
-        <w:t>Automated extraction and generation of High Level Requirements (HLR) from system-level inputs</w:t>
+        <w:t>M2: Derive software architecture and LLRs from SRD-001 HLRs, producing SDDD-001</w:t>
       </w:r>
     </w:p>
     <w:p>
@@ -2677,7 +3201,7 @@
         <w:pStyle w:val="ListParagraph"/>
         <w:numPr>
           <w:ilvl w:val="0"/>
-          <w:numId w:val="41"/>
+          <w:numId w:val="1"/>
         </w:numPr>
         <w:spacing w:before="60" w:after="60"/>
         <w:rPr/>
@@ -2688,7 +3212,7 @@
           <w:sz w:val="22"/>
           <w:szCs w:val="22"/>
         </w:rPr>
-        <w:t>Derivation of Low Level Requirements (LLR) ensuring completeness and consistency with HLR</w:t>
+        <w:t>M3: Generate structured source code from SDDD-001 LLRs into a /src folder with one subfolder per module</w:t>
       </w:r>
     </w:p>
     <w:p>
@@ -2696,7 +3220,7 @@
         <w:pStyle w:val="ListParagraph"/>
         <w:numPr>
           <w:ilvl w:val="0"/>
-          <w:numId w:val="42"/>
+          <w:numId w:val="1"/>
         </w:numPr>
         <w:spacing w:before="60" w:after="60"/>
         <w:rPr/>
@@ -2707,7 +3231,7 @@
           <w:sz w:val="22"/>
           <w:szCs w:val="22"/>
         </w:rPr>
-        <w:t>Source code generation conforming to applicable coding standards (e.g., MISRA-C)</w:t>
+        <w:t>M4: Generate low-level test cases from SDDD-001 LLRs, producing SVCP-LLT-001</w:t>
       </w:r>
     </w:p>
     <w:p>
@@ -2715,7 +3239,7 @@
         <w:pStyle w:val="ListParagraph"/>
         <w:numPr>
           <w:ilvl w:val="0"/>
-          <w:numId w:val="43"/>
+          <w:numId w:val="1"/>
         </w:numPr>
         <w:spacing w:before="60" w:after="60"/>
         <w:rPr/>
@@ -2726,7 +3250,7 @@
           <w:sz w:val="22"/>
           <w:szCs w:val="22"/>
         </w:rPr>
-        <w:t>Automated test case generation for both HLR-based (HLT) and LLR-based (LLT) verification</w:t>
+        <w:t>M5: Generate high-level test cases from SRD-001 HLRs, producing SVCP-HLT-001</w:t>
       </w:r>
     </w:p>
     <w:p>
@@ -2734,7 +3258,7 @@
         <w:pStyle w:val="ListParagraph"/>
         <w:numPr>
           <w:ilvl w:val="0"/>
-          <w:numId w:val="44"/>
+          <w:numId w:val="1"/>
         </w:numPr>
         <w:spacing w:before="60" w:after="60"/>
         <w:rPr/>
@@ -2745,7 +3269,7 @@
           <w:sz w:val="22"/>
           <w:szCs w:val="22"/>
         </w:rPr>
-        <w:t>Bidirectional traceability matrix generation linking all lifecycle artifacts</w:t>
+        <w:t>M6: Aggregate all artifacts and generate bidirectional traceability matrix STD-001</w:t>
       </w:r>
     </w:p>
     <w:p>
@@ -4344,7 +4868,7 @@
         <w:pStyle w:val="ListParagraph"/>
         <w:numPr>
           <w:ilvl w:val="0"/>
-          <w:numId w:val="45"/>
+          <w:numId w:val="28"/>
         </w:numPr>
         <w:spacing w:before="60" w:after="60"/>
         <w:rPr/>
@@ -4363,7 +4887,7 @@
         <w:pStyle w:val="ListParagraph"/>
         <w:numPr>
           <w:ilvl w:val="0"/>
-          <w:numId w:val="46"/>
+          <w:numId w:val="29"/>
         </w:numPr>
         <w:spacing w:before="60" w:after="60"/>
         <w:rPr/>
@@ -4382,7 +4906,7 @@
         <w:pStyle w:val="ListParagraph"/>
         <w:numPr>
           <w:ilvl w:val="0"/>
-          <w:numId w:val="47"/>
+          <w:numId w:val="30"/>
         </w:numPr>
         <w:spacing w:before="60" w:after="60"/>
         <w:rPr/>
@@ -4401,7 +4925,7 @@
         <w:pStyle w:val="ListParagraph"/>
         <w:numPr>
           <w:ilvl w:val="0"/>
-          <w:numId w:val="48"/>
+          <w:numId w:val="31"/>
         </w:numPr>
         <w:spacing w:before="60" w:after="60"/>
         <w:rPr/>
@@ -5567,7 +6091,7 @@
         <w:pStyle w:val="ListParagraph"/>
         <w:numPr>
           <w:ilvl w:val="0"/>
-          <w:numId w:val="49"/>
+          <w:numId w:val="32"/>
         </w:numPr>
         <w:spacing w:before="60" w:after="60"/>
         <w:rPr/>
@@ -5586,7 +6110,7 @@
         <w:pStyle w:val="ListParagraph"/>
         <w:numPr>
           <w:ilvl w:val="0"/>
-          <w:numId w:val="50"/>
+          <w:numId w:val="33"/>
         </w:numPr>
         <w:spacing w:before="60" w:after="60"/>
         <w:rPr/>
@@ -5605,7 +6129,7 @@
         <w:pStyle w:val="ListParagraph"/>
         <w:numPr>
           <w:ilvl w:val="0"/>
-          <w:numId w:val="51"/>
+          <w:numId w:val="34"/>
         </w:numPr>
         <w:spacing w:before="60" w:after="60"/>
         <w:rPr/>
@@ -5667,7 +6191,7 @@
         <w:pStyle w:val="ListParagraph"/>
         <w:numPr>
           <w:ilvl w:val="0"/>
-          <w:numId w:val="52"/>
+          <w:numId w:val="35"/>
         </w:numPr>
         <w:spacing w:before="60" w:after="60"/>
         <w:rPr/>
@@ -5686,7 +6210,7 @@
         <w:pStyle w:val="ListParagraph"/>
         <w:numPr>
           <w:ilvl w:val="0"/>
-          <w:numId w:val="53"/>
+          <w:numId w:val="36"/>
         </w:numPr>
         <w:spacing w:before="60" w:after="60"/>
         <w:rPr/>
@@ -7333,7 +7857,7 @@
         <w:pStyle w:val="ListParagraph"/>
         <w:numPr>
           <w:ilvl w:val="0"/>
-          <w:numId w:val="54"/>
+          <w:numId w:val="37"/>
         </w:numPr>
         <w:spacing w:before="60" w:after="60"/>
         <w:rPr/>
@@ -7352,7 +7876,7 @@
         <w:pStyle w:val="ListParagraph"/>
         <w:numPr>
           <w:ilvl w:val="0"/>
-          <w:numId w:val="55"/>
+          <w:numId w:val="38"/>
         </w:numPr>
         <w:spacing w:before="60" w:after="60"/>
         <w:rPr/>
@@ -7371,7 +7895,7 @@
         <w:pStyle w:val="ListParagraph"/>
         <w:numPr>
           <w:ilvl w:val="0"/>
-          <w:numId w:val="56"/>
+          <w:numId w:val="39"/>
         </w:numPr>
         <w:spacing w:before="60" w:after="60"/>
         <w:rPr/>
@@ -7390,7 +7914,7 @@
         <w:pStyle w:val="ListParagraph"/>
         <w:numPr>
           <w:ilvl w:val="0"/>
-          <w:numId w:val="57"/>
+          <w:numId w:val="40"/>
         </w:numPr>
         <w:spacing w:before="60" w:after="60"/>
         <w:rPr/>
@@ -7467,7 +7991,7 @@
         <w:pStyle w:val="ListParagraph"/>
         <w:numPr>
           <w:ilvl w:val="0"/>
-          <w:numId w:val="58"/>
+          <w:numId w:val="41"/>
         </w:numPr>
         <w:spacing w:before="60" w:after="60"/>
         <w:rPr/>
@@ -7486,7 +8010,7 @@
         <w:pStyle w:val="ListParagraph"/>
         <w:numPr>
           <w:ilvl w:val="0"/>
-          <w:numId w:val="59"/>
+          <w:numId w:val="42"/>
         </w:numPr>
         <w:spacing w:before="60" w:after="60"/>
         <w:rPr/>
@@ -7505,7 +8029,7 @@
         <w:pStyle w:val="ListParagraph"/>
         <w:numPr>
           <w:ilvl w:val="0"/>
-          <w:numId w:val="60"/>
+          <w:numId w:val="43"/>
         </w:numPr>
         <w:spacing w:before="60" w:after="60"/>
         <w:rPr/>
@@ -7524,7 +8048,7 @@
         <w:pStyle w:val="ListParagraph"/>
         <w:numPr>
           <w:ilvl w:val="0"/>
-          <w:numId w:val="61"/>
+          <w:numId w:val="44"/>
         </w:numPr>
         <w:spacing w:before="60" w:after="60"/>
         <w:rPr/>
@@ -7620,8 +8144,8 @@
         </w:tblCellMar>
       </w:tblPr>
       <w:tblGrid>
-        <w:gridCol w:w="996"/>
-        <w:gridCol w:w="1803"/>
+        <w:gridCol w:w="995"/>
+        <w:gridCol w:w="1804"/>
         <w:gridCol w:w="2201"/>
         <w:gridCol w:w="4359"/>
       </w:tblGrid>
@@ -7631,7 +8155,7 @@
         </w:trPr>
         <w:tc>
           <w:tcPr>
-            <w:tcW w:w="996" w:type="dxa"/>
+            <w:tcW w:w="995" w:type="dxa"/>
             <w:tcBorders>
               <w:top w:val="single" w:sz="2" w:space="0" w:color="BBBBBB"/>
               <w:left w:val="single" w:sz="2" w:space="0" w:color="BBBBBB"/>
@@ -7661,7 +8185,7 @@
         </w:tc>
         <w:tc>
           <w:tcPr>
-            <w:tcW w:w="1803" w:type="dxa"/>
+            <w:tcW w:w="1804" w:type="dxa"/>
             <w:tcBorders>
               <w:top w:val="single" w:sz="2" w:space="0" w:color="BBBBBB"/>
               <w:left w:val="single" w:sz="2" w:space="0" w:color="BBBBBB"/>
@@ -7754,7 +8278,7 @@
         <w:trPr/>
         <w:tc>
           <w:tcPr>
-            <w:tcW w:w="996" w:type="dxa"/>
+            <w:tcW w:w="995" w:type="dxa"/>
             <w:tcBorders>
               <w:top w:val="single" w:sz="2" w:space="0" w:color="BBBBBB"/>
               <w:left w:val="single" w:sz="2" w:space="0" w:color="BBBBBB"/>
@@ -7781,7 +8305,7 @@
         </w:tc>
         <w:tc>
           <w:tcPr>
-            <w:tcW w:w="1803" w:type="dxa"/>
+            <w:tcW w:w="1804" w:type="dxa"/>
             <w:tcBorders>
               <w:top w:val="single" w:sz="2" w:space="0" w:color="BBBBBB"/>
               <w:left w:val="single" w:sz="2" w:space="0" w:color="BBBBBB"/>
@@ -7865,7 +8389,7 @@
         <w:trPr/>
         <w:tc>
           <w:tcPr>
-            <w:tcW w:w="996" w:type="dxa"/>
+            <w:tcW w:w="995" w:type="dxa"/>
             <w:tcBorders>
               <w:top w:val="single" w:sz="2" w:space="0" w:color="BBBBBB"/>
               <w:left w:val="single" w:sz="2" w:space="0" w:color="BBBBBB"/>
@@ -7892,7 +8416,7 @@
         </w:tc>
         <w:tc>
           <w:tcPr>
-            <w:tcW w:w="1803" w:type="dxa"/>
+            <w:tcW w:w="1804" w:type="dxa"/>
             <w:tcBorders>
               <w:top w:val="single" w:sz="2" w:space="0" w:color="BBBBBB"/>
               <w:left w:val="single" w:sz="2" w:space="0" w:color="BBBBBB"/>
@@ -7976,7 +8500,7 @@
         <w:trPr/>
         <w:tc>
           <w:tcPr>
-            <w:tcW w:w="996" w:type="dxa"/>
+            <w:tcW w:w="995" w:type="dxa"/>
             <w:tcBorders>
               <w:top w:val="single" w:sz="2" w:space="0" w:color="BBBBBB"/>
               <w:left w:val="single" w:sz="2" w:space="0" w:color="BBBBBB"/>
@@ -8003,7 +8527,7 @@
         </w:tc>
         <w:tc>
           <w:tcPr>
-            <w:tcW w:w="1803" w:type="dxa"/>
+            <w:tcW w:w="1804" w:type="dxa"/>
             <w:tcBorders>
               <w:top w:val="single" w:sz="2" w:space="0" w:color="BBBBBB"/>
               <w:left w:val="single" w:sz="2" w:space="0" w:color="BBBBBB"/>
@@ -8087,7 +8611,7 @@
         <w:trPr/>
         <w:tc>
           <w:tcPr>
-            <w:tcW w:w="996" w:type="dxa"/>
+            <w:tcW w:w="995" w:type="dxa"/>
             <w:tcBorders>
               <w:top w:val="single" w:sz="2" w:space="0" w:color="BBBBBB"/>
               <w:left w:val="single" w:sz="2" w:space="0" w:color="BBBBBB"/>
@@ -8114,7 +8638,7 @@
         </w:tc>
         <w:tc>
           <w:tcPr>
-            <w:tcW w:w="1803" w:type="dxa"/>
+            <w:tcW w:w="1804" w:type="dxa"/>
             <w:tcBorders>
               <w:top w:val="single" w:sz="2" w:space="0" w:color="BBBBBB"/>
               <w:left w:val="single" w:sz="2" w:space="0" w:color="BBBBBB"/>
@@ -8276,7 +8800,7 @@
         <w:pStyle w:val="ListParagraph"/>
         <w:numPr>
           <w:ilvl w:val="0"/>
-          <w:numId w:val="62"/>
+          <w:numId w:val="45"/>
         </w:numPr>
         <w:spacing w:before="60" w:after="60"/>
         <w:rPr/>
@@ -8295,7 +8819,7 @@
         <w:pStyle w:val="ListParagraph"/>
         <w:numPr>
           <w:ilvl w:val="0"/>
-          <w:numId w:val="63"/>
+          <w:numId w:val="46"/>
         </w:numPr>
         <w:spacing w:before="60" w:after="60"/>
         <w:rPr/>
@@ -8314,7 +8838,7 @@
         <w:pStyle w:val="ListParagraph"/>
         <w:numPr>
           <w:ilvl w:val="0"/>
-          <w:numId w:val="64"/>
+          <w:numId w:val="47"/>
         </w:numPr>
         <w:spacing w:before="60" w:after="60"/>
         <w:rPr/>
@@ -8462,7 +8986,7 @@
         <w:pStyle w:val="ListParagraph"/>
         <w:numPr>
           <w:ilvl w:val="0"/>
-          <w:numId w:val="65"/>
+          <w:numId w:val="48"/>
         </w:numPr>
         <w:spacing w:before="60" w:after="60"/>
         <w:rPr/>
@@ -8481,7 +9005,7 @@
         <w:pStyle w:val="ListParagraph"/>
         <w:numPr>
           <w:ilvl w:val="0"/>
-          <w:numId w:val="66"/>
+          <w:numId w:val="49"/>
         </w:numPr>
         <w:spacing w:before="60" w:after="60"/>
         <w:rPr/>
@@ -8500,7 +9024,7 @@
         <w:pStyle w:val="ListParagraph"/>
         <w:numPr>
           <w:ilvl w:val="0"/>
-          <w:numId w:val="67"/>
+          <w:numId w:val="50"/>
         </w:numPr>
         <w:spacing w:before="60" w:after="60"/>
         <w:rPr/>
@@ -9177,7 +9701,24 @@
         <w:sz w:val="18"/>
         <w:szCs w:val="18"/>
       </w:rPr>
-      <w:t>CONFIDENTIAL — End of Study Project</w:t>
+      <w:t xml:space="preserve">CONFIDENTIAL — </w:t>
+    </w:r>
+    <w:r>
+      <w:rPr>
+        <w:rFonts w:eastAsia="Arial" w:cs="Arial"/>
+        <w:color w:val="666666"/>
+        <w:sz w:val="18"/>
+        <w:szCs w:val="18"/>
+      </w:rPr>
+      <w:t>I-SCEET</w:t>
+    </w:r>
+    <w:r>
+      <w:rPr>
+        <w:rFonts w:eastAsia="Arial" w:cs="Arial"/>
+        <w:color w:val="666666"/>
+        <w:sz w:val="18"/>
+        <w:szCs w:val="18"/>
+      </w:rPr>
       <w:tab/>
       <w:t xml:space="preserve">Page </w:t>
     </w:r>
@@ -9222,7 +9763,26 @@
         <w:sz w:val="18"/>
         <w:szCs w:val="18"/>
       </w:rPr>
-      <w:t>PSAC — I-SCEET  |   PSAC-TOOLCHAIN-001   |   v1.0   |   DRAFT</w:t>
+      <w:t>PSAC — I-SCEET  |   PSAC-TOOLCHAIN-001   |   v</w:t>
+    </w:r>
+    <w:r>
+      <w:rPr>
+        <w:rFonts w:eastAsia="Arial" w:cs="Arial"/>
+        <w:color w:val="666666"/>
+        <w:sz w:val="18"/>
+        <w:szCs w:val="18"/>
+      </w:rPr>
+      <w:t>2</w:t>
+    </w:r>
+    <w:r>
+      <w:rPr>
+        <w:rFonts w:eastAsia="Arial" w:cs="Arial"/>
+        <w:color w:val="666666"/>
+        <w:sz w:val="18"/>
+        <w:szCs w:val="18"/>
+      </w:rPr>
+      <w:t>.0   |   DRAFT</w:t>
+      <w:tab/>
     </w:r>
   </w:p>
 </w:hdr>
@@ -12256,974 +12816,6 @@
     </w:lvl>
   </w:abstractNum>
   <w:abstractNum w:abstractNumId="26">
-    <w:lvl w:ilvl="0">
-      <w:start w:val="1"/>
-      <w:numFmt w:val="bullet"/>
-      <w:lvlText w:val=""/>
-      <w:lvlJc w:val="left"/>
-      <w:pPr>
-        <w:tabs>
-          <w:tab w:val="num" w:pos="0"/>
-        </w:tabs>
-        <w:ind w:left="720" w:hanging="360"/>
-      </w:pPr>
-      <w:rPr>
-        <w:rFonts w:ascii="Symbol" w:hAnsi="Symbol" w:cs="Symbol" w:hint="default"/>
-      </w:rPr>
-    </w:lvl>
-    <w:lvl w:ilvl="1">
-      <w:start w:val="1"/>
-      <w:numFmt w:val="decimal"/>
-      <w:lvlText w:val="%2."/>
-      <w:lvlJc w:val="left"/>
-      <w:pPr>
-        <w:tabs>
-          <w:tab w:val="num" w:pos="1080"/>
-        </w:tabs>
-        <w:ind w:left="1080" w:hanging="360"/>
-      </w:pPr>
-      <w:rPr/>
-    </w:lvl>
-    <w:lvl w:ilvl="2">
-      <w:start w:val="1"/>
-      <w:numFmt w:val="decimal"/>
-      <w:lvlText w:val="%3."/>
-      <w:lvlJc w:val="left"/>
-      <w:pPr>
-        <w:tabs>
-          <w:tab w:val="num" w:pos="1440"/>
-        </w:tabs>
-        <w:ind w:left="1440" w:hanging="360"/>
-      </w:pPr>
-      <w:rPr/>
-    </w:lvl>
-    <w:lvl w:ilvl="3">
-      <w:start w:val="1"/>
-      <w:numFmt w:val="decimal"/>
-      <w:lvlText w:val="%4."/>
-      <w:lvlJc w:val="left"/>
-      <w:pPr>
-        <w:tabs>
-          <w:tab w:val="num" w:pos="1800"/>
-        </w:tabs>
-        <w:ind w:left="1800" w:hanging="360"/>
-      </w:pPr>
-      <w:rPr/>
-    </w:lvl>
-    <w:lvl w:ilvl="4">
-      <w:start w:val="1"/>
-      <w:numFmt w:val="decimal"/>
-      <w:lvlText w:val="%5."/>
-      <w:lvlJc w:val="left"/>
-      <w:pPr>
-        <w:tabs>
-          <w:tab w:val="num" w:pos="2160"/>
-        </w:tabs>
-        <w:ind w:left="2160" w:hanging="360"/>
-      </w:pPr>
-      <w:rPr/>
-    </w:lvl>
-    <w:lvl w:ilvl="5">
-      <w:start w:val="1"/>
-      <w:numFmt w:val="decimal"/>
-      <w:lvlText w:val="%6."/>
-      <w:lvlJc w:val="left"/>
-      <w:pPr>
-        <w:tabs>
-          <w:tab w:val="num" w:pos="2520"/>
-        </w:tabs>
-        <w:ind w:left="2520" w:hanging="360"/>
-      </w:pPr>
-      <w:rPr/>
-    </w:lvl>
-    <w:lvl w:ilvl="6">
-      <w:start w:val="1"/>
-      <w:numFmt w:val="decimal"/>
-      <w:lvlText w:val="%7."/>
-      <w:lvlJc w:val="left"/>
-      <w:pPr>
-        <w:tabs>
-          <w:tab w:val="num" w:pos="2880"/>
-        </w:tabs>
-        <w:ind w:left="2880" w:hanging="360"/>
-      </w:pPr>
-      <w:rPr/>
-    </w:lvl>
-    <w:lvl w:ilvl="7">
-      <w:start w:val="1"/>
-      <w:numFmt w:val="decimal"/>
-      <w:lvlText w:val="%8."/>
-      <w:lvlJc w:val="left"/>
-      <w:pPr>
-        <w:tabs>
-          <w:tab w:val="num" w:pos="3240"/>
-        </w:tabs>
-        <w:ind w:left="3240" w:hanging="360"/>
-      </w:pPr>
-      <w:rPr/>
-    </w:lvl>
-    <w:lvl w:ilvl="8">
-      <w:start w:val="1"/>
-      <w:numFmt w:val="decimal"/>
-      <w:lvlText w:val="%9."/>
-      <w:lvlJc w:val="left"/>
-      <w:pPr>
-        <w:tabs>
-          <w:tab w:val="num" w:pos="3600"/>
-        </w:tabs>
-        <w:ind w:left="3600" w:hanging="360"/>
-      </w:pPr>
-      <w:rPr/>
-    </w:lvl>
-  </w:abstractNum>
-  <w:abstractNum w:abstractNumId="27">
-    <w:lvl w:ilvl="0">
-      <w:start w:val="1"/>
-      <w:numFmt w:val="bullet"/>
-      <w:lvlText w:val=""/>
-      <w:lvlJc w:val="left"/>
-      <w:pPr>
-        <w:tabs>
-          <w:tab w:val="num" w:pos="0"/>
-        </w:tabs>
-        <w:ind w:left="720" w:hanging="360"/>
-      </w:pPr>
-      <w:rPr>
-        <w:rFonts w:ascii="Symbol" w:hAnsi="Symbol" w:cs="Symbol" w:hint="default"/>
-      </w:rPr>
-    </w:lvl>
-    <w:lvl w:ilvl="1">
-      <w:start w:val="1"/>
-      <w:numFmt w:val="decimal"/>
-      <w:lvlText w:val="%2."/>
-      <w:lvlJc w:val="left"/>
-      <w:pPr>
-        <w:tabs>
-          <w:tab w:val="num" w:pos="1080"/>
-        </w:tabs>
-        <w:ind w:left="1080" w:hanging="360"/>
-      </w:pPr>
-      <w:rPr/>
-    </w:lvl>
-    <w:lvl w:ilvl="2">
-      <w:start w:val="1"/>
-      <w:numFmt w:val="decimal"/>
-      <w:lvlText w:val="%3."/>
-      <w:lvlJc w:val="left"/>
-      <w:pPr>
-        <w:tabs>
-          <w:tab w:val="num" w:pos="1440"/>
-        </w:tabs>
-        <w:ind w:left="1440" w:hanging="360"/>
-      </w:pPr>
-      <w:rPr/>
-    </w:lvl>
-    <w:lvl w:ilvl="3">
-      <w:start w:val="1"/>
-      <w:numFmt w:val="decimal"/>
-      <w:lvlText w:val="%4."/>
-      <w:lvlJc w:val="left"/>
-      <w:pPr>
-        <w:tabs>
-          <w:tab w:val="num" w:pos="1800"/>
-        </w:tabs>
-        <w:ind w:left="1800" w:hanging="360"/>
-      </w:pPr>
-      <w:rPr/>
-    </w:lvl>
-    <w:lvl w:ilvl="4">
-      <w:start w:val="1"/>
-      <w:numFmt w:val="decimal"/>
-      <w:lvlText w:val="%5."/>
-      <w:lvlJc w:val="left"/>
-      <w:pPr>
-        <w:tabs>
-          <w:tab w:val="num" w:pos="2160"/>
-        </w:tabs>
-        <w:ind w:left="2160" w:hanging="360"/>
-      </w:pPr>
-      <w:rPr/>
-    </w:lvl>
-    <w:lvl w:ilvl="5">
-      <w:start w:val="1"/>
-      <w:numFmt w:val="decimal"/>
-      <w:lvlText w:val="%6."/>
-      <w:lvlJc w:val="left"/>
-      <w:pPr>
-        <w:tabs>
-          <w:tab w:val="num" w:pos="2520"/>
-        </w:tabs>
-        <w:ind w:left="2520" w:hanging="360"/>
-      </w:pPr>
-      <w:rPr/>
-    </w:lvl>
-    <w:lvl w:ilvl="6">
-      <w:start w:val="1"/>
-      <w:numFmt w:val="decimal"/>
-      <w:lvlText w:val="%7."/>
-      <w:lvlJc w:val="left"/>
-      <w:pPr>
-        <w:tabs>
-          <w:tab w:val="num" w:pos="2880"/>
-        </w:tabs>
-        <w:ind w:left="2880" w:hanging="360"/>
-      </w:pPr>
-      <w:rPr/>
-    </w:lvl>
-    <w:lvl w:ilvl="7">
-      <w:start w:val="1"/>
-      <w:numFmt w:val="decimal"/>
-      <w:lvlText w:val="%8."/>
-      <w:lvlJc w:val="left"/>
-      <w:pPr>
-        <w:tabs>
-          <w:tab w:val="num" w:pos="3240"/>
-        </w:tabs>
-        <w:ind w:left="3240" w:hanging="360"/>
-      </w:pPr>
-      <w:rPr/>
-    </w:lvl>
-    <w:lvl w:ilvl="8">
-      <w:start w:val="1"/>
-      <w:numFmt w:val="decimal"/>
-      <w:lvlText w:val="%9."/>
-      <w:lvlJc w:val="left"/>
-      <w:pPr>
-        <w:tabs>
-          <w:tab w:val="num" w:pos="3600"/>
-        </w:tabs>
-        <w:ind w:left="3600" w:hanging="360"/>
-      </w:pPr>
-      <w:rPr/>
-    </w:lvl>
-  </w:abstractNum>
-  <w:abstractNum w:abstractNumId="28">
-    <w:lvl w:ilvl="0">
-      <w:start w:val="1"/>
-      <w:numFmt w:val="bullet"/>
-      <w:lvlText w:val=""/>
-      <w:lvlJc w:val="left"/>
-      <w:pPr>
-        <w:tabs>
-          <w:tab w:val="num" w:pos="0"/>
-        </w:tabs>
-        <w:ind w:left="720" w:hanging="360"/>
-      </w:pPr>
-      <w:rPr>
-        <w:rFonts w:ascii="Symbol" w:hAnsi="Symbol" w:cs="Symbol" w:hint="default"/>
-      </w:rPr>
-    </w:lvl>
-    <w:lvl w:ilvl="1">
-      <w:start w:val="1"/>
-      <w:numFmt w:val="decimal"/>
-      <w:lvlText w:val="%2."/>
-      <w:lvlJc w:val="left"/>
-      <w:pPr>
-        <w:tabs>
-          <w:tab w:val="num" w:pos="1080"/>
-        </w:tabs>
-        <w:ind w:left="1080" w:hanging="360"/>
-      </w:pPr>
-      <w:rPr/>
-    </w:lvl>
-    <w:lvl w:ilvl="2">
-      <w:start w:val="1"/>
-      <w:numFmt w:val="decimal"/>
-      <w:lvlText w:val="%3."/>
-      <w:lvlJc w:val="left"/>
-      <w:pPr>
-        <w:tabs>
-          <w:tab w:val="num" w:pos="1440"/>
-        </w:tabs>
-        <w:ind w:left="1440" w:hanging="360"/>
-      </w:pPr>
-      <w:rPr/>
-    </w:lvl>
-    <w:lvl w:ilvl="3">
-      <w:start w:val="1"/>
-      <w:numFmt w:val="decimal"/>
-      <w:lvlText w:val="%4."/>
-      <w:lvlJc w:val="left"/>
-      <w:pPr>
-        <w:tabs>
-          <w:tab w:val="num" w:pos="1800"/>
-        </w:tabs>
-        <w:ind w:left="1800" w:hanging="360"/>
-      </w:pPr>
-      <w:rPr/>
-    </w:lvl>
-    <w:lvl w:ilvl="4">
-      <w:start w:val="1"/>
-      <w:numFmt w:val="decimal"/>
-      <w:lvlText w:val="%5."/>
-      <w:lvlJc w:val="left"/>
-      <w:pPr>
-        <w:tabs>
-          <w:tab w:val="num" w:pos="2160"/>
-        </w:tabs>
-        <w:ind w:left="2160" w:hanging="360"/>
-      </w:pPr>
-      <w:rPr/>
-    </w:lvl>
-    <w:lvl w:ilvl="5">
-      <w:start w:val="1"/>
-      <w:numFmt w:val="decimal"/>
-      <w:lvlText w:val="%6."/>
-      <w:lvlJc w:val="left"/>
-      <w:pPr>
-        <w:tabs>
-          <w:tab w:val="num" w:pos="2520"/>
-        </w:tabs>
-        <w:ind w:left="2520" w:hanging="360"/>
-      </w:pPr>
-      <w:rPr/>
-    </w:lvl>
-    <w:lvl w:ilvl="6">
-      <w:start w:val="1"/>
-      <w:numFmt w:val="decimal"/>
-      <w:lvlText w:val="%7."/>
-      <w:lvlJc w:val="left"/>
-      <w:pPr>
-        <w:tabs>
-          <w:tab w:val="num" w:pos="2880"/>
-        </w:tabs>
-        <w:ind w:left="2880" w:hanging="360"/>
-      </w:pPr>
-      <w:rPr/>
-    </w:lvl>
-    <w:lvl w:ilvl="7">
-      <w:start w:val="1"/>
-      <w:numFmt w:val="decimal"/>
-      <w:lvlText w:val="%8."/>
-      <w:lvlJc w:val="left"/>
-      <w:pPr>
-        <w:tabs>
-          <w:tab w:val="num" w:pos="3240"/>
-        </w:tabs>
-        <w:ind w:left="3240" w:hanging="360"/>
-      </w:pPr>
-      <w:rPr/>
-    </w:lvl>
-    <w:lvl w:ilvl="8">
-      <w:start w:val="1"/>
-      <w:numFmt w:val="decimal"/>
-      <w:lvlText w:val="%9."/>
-      <w:lvlJc w:val="left"/>
-      <w:pPr>
-        <w:tabs>
-          <w:tab w:val="num" w:pos="3600"/>
-        </w:tabs>
-        <w:ind w:left="3600" w:hanging="360"/>
-      </w:pPr>
-      <w:rPr/>
-    </w:lvl>
-  </w:abstractNum>
-  <w:abstractNum w:abstractNumId="29">
-    <w:lvl w:ilvl="0">
-      <w:start w:val="1"/>
-      <w:numFmt w:val="bullet"/>
-      <w:lvlText w:val=""/>
-      <w:lvlJc w:val="left"/>
-      <w:pPr>
-        <w:tabs>
-          <w:tab w:val="num" w:pos="0"/>
-        </w:tabs>
-        <w:ind w:left="720" w:hanging="360"/>
-      </w:pPr>
-      <w:rPr>
-        <w:rFonts w:ascii="Symbol" w:hAnsi="Symbol" w:cs="Symbol" w:hint="default"/>
-      </w:rPr>
-    </w:lvl>
-    <w:lvl w:ilvl="1">
-      <w:start w:val="1"/>
-      <w:numFmt w:val="decimal"/>
-      <w:lvlText w:val="%2."/>
-      <w:lvlJc w:val="left"/>
-      <w:pPr>
-        <w:tabs>
-          <w:tab w:val="num" w:pos="1080"/>
-        </w:tabs>
-        <w:ind w:left="1080" w:hanging="360"/>
-      </w:pPr>
-      <w:rPr/>
-    </w:lvl>
-    <w:lvl w:ilvl="2">
-      <w:start w:val="1"/>
-      <w:numFmt w:val="decimal"/>
-      <w:lvlText w:val="%3."/>
-      <w:lvlJc w:val="left"/>
-      <w:pPr>
-        <w:tabs>
-          <w:tab w:val="num" w:pos="1440"/>
-        </w:tabs>
-        <w:ind w:left="1440" w:hanging="360"/>
-      </w:pPr>
-      <w:rPr/>
-    </w:lvl>
-    <w:lvl w:ilvl="3">
-      <w:start w:val="1"/>
-      <w:numFmt w:val="decimal"/>
-      <w:lvlText w:val="%4."/>
-      <w:lvlJc w:val="left"/>
-      <w:pPr>
-        <w:tabs>
-          <w:tab w:val="num" w:pos="1800"/>
-        </w:tabs>
-        <w:ind w:left="1800" w:hanging="360"/>
-      </w:pPr>
-      <w:rPr/>
-    </w:lvl>
-    <w:lvl w:ilvl="4">
-      <w:start w:val="1"/>
-      <w:numFmt w:val="decimal"/>
-      <w:lvlText w:val="%5."/>
-      <w:lvlJc w:val="left"/>
-      <w:pPr>
-        <w:tabs>
-          <w:tab w:val="num" w:pos="2160"/>
-        </w:tabs>
-        <w:ind w:left="2160" w:hanging="360"/>
-      </w:pPr>
-      <w:rPr/>
-    </w:lvl>
-    <w:lvl w:ilvl="5">
-      <w:start w:val="1"/>
-      <w:numFmt w:val="decimal"/>
-      <w:lvlText w:val="%6."/>
-      <w:lvlJc w:val="left"/>
-      <w:pPr>
-        <w:tabs>
-          <w:tab w:val="num" w:pos="2520"/>
-        </w:tabs>
-        <w:ind w:left="2520" w:hanging="360"/>
-      </w:pPr>
-      <w:rPr/>
-    </w:lvl>
-    <w:lvl w:ilvl="6">
-      <w:start w:val="1"/>
-      <w:numFmt w:val="decimal"/>
-      <w:lvlText w:val="%7."/>
-      <w:lvlJc w:val="left"/>
-      <w:pPr>
-        <w:tabs>
-          <w:tab w:val="num" w:pos="2880"/>
-        </w:tabs>
-        <w:ind w:left="2880" w:hanging="360"/>
-      </w:pPr>
-      <w:rPr/>
-    </w:lvl>
-    <w:lvl w:ilvl="7">
-      <w:start w:val="1"/>
-      <w:numFmt w:val="decimal"/>
-      <w:lvlText w:val="%8."/>
-      <w:lvlJc w:val="left"/>
-      <w:pPr>
-        <w:tabs>
-          <w:tab w:val="num" w:pos="3240"/>
-        </w:tabs>
-        <w:ind w:left="3240" w:hanging="360"/>
-      </w:pPr>
-      <w:rPr/>
-    </w:lvl>
-    <w:lvl w:ilvl="8">
-      <w:start w:val="1"/>
-      <w:numFmt w:val="decimal"/>
-      <w:lvlText w:val="%9."/>
-      <w:lvlJc w:val="left"/>
-      <w:pPr>
-        <w:tabs>
-          <w:tab w:val="num" w:pos="3600"/>
-        </w:tabs>
-        <w:ind w:left="3600" w:hanging="360"/>
-      </w:pPr>
-      <w:rPr/>
-    </w:lvl>
-  </w:abstractNum>
-  <w:abstractNum w:abstractNumId="30">
-    <w:lvl w:ilvl="0">
-      <w:start w:val="1"/>
-      <w:numFmt w:val="bullet"/>
-      <w:lvlText w:val=""/>
-      <w:lvlJc w:val="left"/>
-      <w:pPr>
-        <w:tabs>
-          <w:tab w:val="num" w:pos="0"/>
-        </w:tabs>
-        <w:ind w:left="720" w:hanging="360"/>
-      </w:pPr>
-      <w:rPr>
-        <w:rFonts w:ascii="Symbol" w:hAnsi="Symbol" w:cs="Symbol" w:hint="default"/>
-      </w:rPr>
-    </w:lvl>
-    <w:lvl w:ilvl="1">
-      <w:start w:val="1"/>
-      <w:numFmt w:val="decimal"/>
-      <w:lvlText w:val="%2."/>
-      <w:lvlJc w:val="left"/>
-      <w:pPr>
-        <w:tabs>
-          <w:tab w:val="num" w:pos="1080"/>
-        </w:tabs>
-        <w:ind w:left="1080" w:hanging="360"/>
-      </w:pPr>
-      <w:rPr/>
-    </w:lvl>
-    <w:lvl w:ilvl="2">
-      <w:start w:val="1"/>
-      <w:numFmt w:val="decimal"/>
-      <w:lvlText w:val="%3."/>
-      <w:lvlJc w:val="left"/>
-      <w:pPr>
-        <w:tabs>
-          <w:tab w:val="num" w:pos="1440"/>
-        </w:tabs>
-        <w:ind w:left="1440" w:hanging="360"/>
-      </w:pPr>
-      <w:rPr/>
-    </w:lvl>
-    <w:lvl w:ilvl="3">
-      <w:start w:val="1"/>
-      <w:numFmt w:val="decimal"/>
-      <w:lvlText w:val="%4."/>
-      <w:lvlJc w:val="left"/>
-      <w:pPr>
-        <w:tabs>
-          <w:tab w:val="num" w:pos="1800"/>
-        </w:tabs>
-        <w:ind w:left="1800" w:hanging="360"/>
-      </w:pPr>
-      <w:rPr/>
-    </w:lvl>
-    <w:lvl w:ilvl="4">
-      <w:start w:val="1"/>
-      <w:numFmt w:val="decimal"/>
-      <w:lvlText w:val="%5."/>
-      <w:lvlJc w:val="left"/>
-      <w:pPr>
-        <w:tabs>
-          <w:tab w:val="num" w:pos="2160"/>
-        </w:tabs>
-        <w:ind w:left="2160" w:hanging="360"/>
-      </w:pPr>
-      <w:rPr/>
-    </w:lvl>
-    <w:lvl w:ilvl="5">
-      <w:start w:val="1"/>
-      <w:numFmt w:val="decimal"/>
-      <w:lvlText w:val="%6."/>
-      <w:lvlJc w:val="left"/>
-      <w:pPr>
-        <w:tabs>
-          <w:tab w:val="num" w:pos="2520"/>
-        </w:tabs>
-        <w:ind w:left="2520" w:hanging="360"/>
-      </w:pPr>
-      <w:rPr/>
-    </w:lvl>
-    <w:lvl w:ilvl="6">
-      <w:start w:val="1"/>
-      <w:numFmt w:val="decimal"/>
-      <w:lvlText w:val="%7."/>
-      <w:lvlJc w:val="left"/>
-      <w:pPr>
-        <w:tabs>
-          <w:tab w:val="num" w:pos="2880"/>
-        </w:tabs>
-        <w:ind w:left="2880" w:hanging="360"/>
-      </w:pPr>
-      <w:rPr/>
-    </w:lvl>
-    <w:lvl w:ilvl="7">
-      <w:start w:val="1"/>
-      <w:numFmt w:val="decimal"/>
-      <w:lvlText w:val="%8."/>
-      <w:lvlJc w:val="left"/>
-      <w:pPr>
-        <w:tabs>
-          <w:tab w:val="num" w:pos="3240"/>
-        </w:tabs>
-        <w:ind w:left="3240" w:hanging="360"/>
-      </w:pPr>
-      <w:rPr/>
-    </w:lvl>
-    <w:lvl w:ilvl="8">
-      <w:start w:val="1"/>
-      <w:numFmt w:val="decimal"/>
-      <w:lvlText w:val="%9."/>
-      <w:lvlJc w:val="left"/>
-      <w:pPr>
-        <w:tabs>
-          <w:tab w:val="num" w:pos="3600"/>
-        </w:tabs>
-        <w:ind w:left="3600" w:hanging="360"/>
-      </w:pPr>
-      <w:rPr/>
-    </w:lvl>
-  </w:abstractNum>
-  <w:abstractNum w:abstractNumId="31">
-    <w:lvl w:ilvl="0">
-      <w:start w:val="1"/>
-      <w:numFmt w:val="bullet"/>
-      <w:lvlText w:val=""/>
-      <w:lvlJc w:val="left"/>
-      <w:pPr>
-        <w:tabs>
-          <w:tab w:val="num" w:pos="0"/>
-        </w:tabs>
-        <w:ind w:left="720" w:hanging="360"/>
-      </w:pPr>
-      <w:rPr>
-        <w:rFonts w:ascii="Symbol" w:hAnsi="Symbol" w:cs="Symbol" w:hint="default"/>
-      </w:rPr>
-    </w:lvl>
-    <w:lvl w:ilvl="1">
-      <w:start w:val="1"/>
-      <w:numFmt w:val="decimal"/>
-      <w:lvlText w:val="%2."/>
-      <w:lvlJc w:val="left"/>
-      <w:pPr>
-        <w:tabs>
-          <w:tab w:val="num" w:pos="1080"/>
-        </w:tabs>
-        <w:ind w:left="1080" w:hanging="360"/>
-      </w:pPr>
-      <w:rPr/>
-    </w:lvl>
-    <w:lvl w:ilvl="2">
-      <w:start w:val="1"/>
-      <w:numFmt w:val="decimal"/>
-      <w:lvlText w:val="%3."/>
-      <w:lvlJc w:val="left"/>
-      <w:pPr>
-        <w:tabs>
-          <w:tab w:val="num" w:pos="1440"/>
-        </w:tabs>
-        <w:ind w:left="1440" w:hanging="360"/>
-      </w:pPr>
-      <w:rPr/>
-    </w:lvl>
-    <w:lvl w:ilvl="3">
-      <w:start w:val="1"/>
-      <w:numFmt w:val="decimal"/>
-      <w:lvlText w:val="%4."/>
-      <w:lvlJc w:val="left"/>
-      <w:pPr>
-        <w:tabs>
-          <w:tab w:val="num" w:pos="1800"/>
-        </w:tabs>
-        <w:ind w:left="1800" w:hanging="360"/>
-      </w:pPr>
-      <w:rPr/>
-    </w:lvl>
-    <w:lvl w:ilvl="4">
-      <w:start w:val="1"/>
-      <w:numFmt w:val="decimal"/>
-      <w:lvlText w:val="%5."/>
-      <w:lvlJc w:val="left"/>
-      <w:pPr>
-        <w:tabs>
-          <w:tab w:val="num" w:pos="2160"/>
-        </w:tabs>
-        <w:ind w:left="2160" w:hanging="360"/>
-      </w:pPr>
-      <w:rPr/>
-    </w:lvl>
-    <w:lvl w:ilvl="5">
-      <w:start w:val="1"/>
-      <w:numFmt w:val="decimal"/>
-      <w:lvlText w:val="%6."/>
-      <w:lvlJc w:val="left"/>
-      <w:pPr>
-        <w:tabs>
-          <w:tab w:val="num" w:pos="2520"/>
-        </w:tabs>
-        <w:ind w:left="2520" w:hanging="360"/>
-      </w:pPr>
-      <w:rPr/>
-    </w:lvl>
-    <w:lvl w:ilvl="6">
-      <w:start w:val="1"/>
-      <w:numFmt w:val="decimal"/>
-      <w:lvlText w:val="%7."/>
-      <w:lvlJc w:val="left"/>
-      <w:pPr>
-        <w:tabs>
-          <w:tab w:val="num" w:pos="2880"/>
-        </w:tabs>
-        <w:ind w:left="2880" w:hanging="360"/>
-      </w:pPr>
-      <w:rPr/>
-    </w:lvl>
-    <w:lvl w:ilvl="7">
-      <w:start w:val="1"/>
-      <w:numFmt w:val="decimal"/>
-      <w:lvlText w:val="%8."/>
-      <w:lvlJc w:val="left"/>
-      <w:pPr>
-        <w:tabs>
-          <w:tab w:val="num" w:pos="3240"/>
-        </w:tabs>
-        <w:ind w:left="3240" w:hanging="360"/>
-      </w:pPr>
-      <w:rPr/>
-    </w:lvl>
-    <w:lvl w:ilvl="8">
-      <w:start w:val="1"/>
-      <w:numFmt w:val="decimal"/>
-      <w:lvlText w:val="%9."/>
-      <w:lvlJc w:val="left"/>
-      <w:pPr>
-        <w:tabs>
-          <w:tab w:val="num" w:pos="3600"/>
-        </w:tabs>
-        <w:ind w:left="3600" w:hanging="360"/>
-      </w:pPr>
-      <w:rPr/>
-    </w:lvl>
-  </w:abstractNum>
-  <w:abstractNum w:abstractNumId="32">
-    <w:lvl w:ilvl="0">
-      <w:start w:val="1"/>
-      <w:numFmt w:val="bullet"/>
-      <w:lvlText w:val=""/>
-      <w:lvlJc w:val="left"/>
-      <w:pPr>
-        <w:tabs>
-          <w:tab w:val="num" w:pos="0"/>
-        </w:tabs>
-        <w:ind w:left="720" w:hanging="360"/>
-      </w:pPr>
-      <w:rPr>
-        <w:rFonts w:ascii="Symbol" w:hAnsi="Symbol" w:cs="Symbol" w:hint="default"/>
-      </w:rPr>
-    </w:lvl>
-    <w:lvl w:ilvl="1">
-      <w:start w:val="1"/>
-      <w:numFmt w:val="decimal"/>
-      <w:lvlText w:val="%2."/>
-      <w:lvlJc w:val="left"/>
-      <w:pPr>
-        <w:tabs>
-          <w:tab w:val="num" w:pos="1080"/>
-        </w:tabs>
-        <w:ind w:left="1080" w:hanging="360"/>
-      </w:pPr>
-      <w:rPr/>
-    </w:lvl>
-    <w:lvl w:ilvl="2">
-      <w:start w:val="1"/>
-      <w:numFmt w:val="decimal"/>
-      <w:lvlText w:val="%3."/>
-      <w:lvlJc w:val="left"/>
-      <w:pPr>
-        <w:tabs>
-          <w:tab w:val="num" w:pos="1440"/>
-        </w:tabs>
-        <w:ind w:left="1440" w:hanging="360"/>
-      </w:pPr>
-      <w:rPr/>
-    </w:lvl>
-    <w:lvl w:ilvl="3">
-      <w:start w:val="1"/>
-      <w:numFmt w:val="decimal"/>
-      <w:lvlText w:val="%4."/>
-      <w:lvlJc w:val="left"/>
-      <w:pPr>
-        <w:tabs>
-          <w:tab w:val="num" w:pos="1800"/>
-        </w:tabs>
-        <w:ind w:left="1800" w:hanging="360"/>
-      </w:pPr>
-      <w:rPr/>
-    </w:lvl>
-    <w:lvl w:ilvl="4">
-      <w:start w:val="1"/>
-      <w:numFmt w:val="decimal"/>
-      <w:lvlText w:val="%5."/>
-      <w:lvlJc w:val="left"/>
-      <w:pPr>
-        <w:tabs>
-          <w:tab w:val="num" w:pos="2160"/>
-        </w:tabs>
-        <w:ind w:left="2160" w:hanging="360"/>
-      </w:pPr>
-      <w:rPr/>
-    </w:lvl>
-    <w:lvl w:ilvl="5">
-      <w:start w:val="1"/>
-      <w:numFmt w:val="decimal"/>
-      <w:lvlText w:val="%6."/>
-      <w:lvlJc w:val="left"/>
-      <w:pPr>
-        <w:tabs>
-          <w:tab w:val="num" w:pos="2520"/>
-        </w:tabs>
-        <w:ind w:left="2520" w:hanging="360"/>
-      </w:pPr>
-      <w:rPr/>
-    </w:lvl>
-    <w:lvl w:ilvl="6">
-      <w:start w:val="1"/>
-      <w:numFmt w:val="decimal"/>
-      <w:lvlText w:val="%7."/>
-      <w:lvlJc w:val="left"/>
-      <w:pPr>
-        <w:tabs>
-          <w:tab w:val="num" w:pos="2880"/>
-        </w:tabs>
-        <w:ind w:left="2880" w:hanging="360"/>
-      </w:pPr>
-      <w:rPr/>
-    </w:lvl>
-    <w:lvl w:ilvl="7">
-      <w:start w:val="1"/>
-      <w:numFmt w:val="decimal"/>
-      <w:lvlText w:val="%8."/>
-      <w:lvlJc w:val="left"/>
-      <w:pPr>
-        <w:tabs>
-          <w:tab w:val="num" w:pos="3240"/>
-        </w:tabs>
-        <w:ind w:left="3240" w:hanging="360"/>
-      </w:pPr>
-      <w:rPr/>
-    </w:lvl>
-    <w:lvl w:ilvl="8">
-      <w:start w:val="1"/>
-      <w:numFmt w:val="decimal"/>
-      <w:lvlText w:val="%9."/>
-      <w:lvlJc w:val="left"/>
-      <w:pPr>
-        <w:tabs>
-          <w:tab w:val="num" w:pos="3600"/>
-        </w:tabs>
-        <w:ind w:left="3600" w:hanging="360"/>
-      </w:pPr>
-      <w:rPr/>
-    </w:lvl>
-  </w:abstractNum>
-  <w:abstractNum w:abstractNumId="33">
-    <w:lvl w:ilvl="0">
-      <w:start w:val="1"/>
-      <w:numFmt w:val="bullet"/>
-      <w:lvlText w:val=""/>
-      <w:lvlJc w:val="left"/>
-      <w:pPr>
-        <w:tabs>
-          <w:tab w:val="num" w:pos="0"/>
-        </w:tabs>
-        <w:ind w:left="720" w:hanging="360"/>
-      </w:pPr>
-      <w:rPr>
-        <w:rFonts w:ascii="Symbol" w:hAnsi="Symbol" w:cs="Symbol" w:hint="default"/>
-      </w:rPr>
-    </w:lvl>
-    <w:lvl w:ilvl="1">
-      <w:start w:val="1"/>
-      <w:numFmt w:val="decimal"/>
-      <w:lvlText w:val="%2."/>
-      <w:lvlJc w:val="left"/>
-      <w:pPr>
-        <w:tabs>
-          <w:tab w:val="num" w:pos="1080"/>
-        </w:tabs>
-        <w:ind w:left="1080" w:hanging="360"/>
-      </w:pPr>
-      <w:rPr/>
-    </w:lvl>
-    <w:lvl w:ilvl="2">
-      <w:start w:val="1"/>
-      <w:numFmt w:val="decimal"/>
-      <w:lvlText w:val="%3."/>
-      <w:lvlJc w:val="left"/>
-      <w:pPr>
-        <w:tabs>
-          <w:tab w:val="num" w:pos="1440"/>
-        </w:tabs>
-        <w:ind w:left="1440" w:hanging="360"/>
-      </w:pPr>
-      <w:rPr/>
-    </w:lvl>
-    <w:lvl w:ilvl="3">
-      <w:start w:val="1"/>
-      <w:numFmt w:val="decimal"/>
-      <w:lvlText w:val="%4."/>
-      <w:lvlJc w:val="left"/>
-      <w:pPr>
-        <w:tabs>
-          <w:tab w:val="num" w:pos="1800"/>
-        </w:tabs>
-        <w:ind w:left="1800" w:hanging="360"/>
-      </w:pPr>
-      <w:rPr/>
-    </w:lvl>
-    <w:lvl w:ilvl="4">
-      <w:start w:val="1"/>
-      <w:numFmt w:val="decimal"/>
-      <w:lvlText w:val="%5."/>
-      <w:lvlJc w:val="left"/>
-      <w:pPr>
-        <w:tabs>
-          <w:tab w:val="num" w:pos="2160"/>
-        </w:tabs>
-        <w:ind w:left="2160" w:hanging="360"/>
-      </w:pPr>
-      <w:rPr/>
-    </w:lvl>
-    <w:lvl w:ilvl="5">
-      <w:start w:val="1"/>
-      <w:numFmt w:val="decimal"/>
-      <w:lvlText w:val="%6."/>
-      <w:lvlJc w:val="left"/>
-      <w:pPr>
-        <w:tabs>
-          <w:tab w:val="num" w:pos="2520"/>
-        </w:tabs>
-        <w:ind w:left="2520" w:hanging="360"/>
-      </w:pPr>
-      <w:rPr/>
-    </w:lvl>
-    <w:lvl w:ilvl="6">
-      <w:start w:val="1"/>
-      <w:numFmt w:val="decimal"/>
-      <w:lvlText w:val="%7."/>
-      <w:lvlJc w:val="left"/>
-      <w:pPr>
-        <w:tabs>
-          <w:tab w:val="num" w:pos="2880"/>
-        </w:tabs>
-        <w:ind w:left="2880" w:hanging="360"/>
-      </w:pPr>
-      <w:rPr/>
-    </w:lvl>
-    <w:lvl w:ilvl="7">
-      <w:start w:val="1"/>
-      <w:numFmt w:val="decimal"/>
-      <w:lvlText w:val="%8."/>
-      <w:lvlJc w:val="left"/>
-      <w:pPr>
-        <w:tabs>
-          <w:tab w:val="num" w:pos="3240"/>
-        </w:tabs>
-        <w:ind w:left="3240" w:hanging="360"/>
-      </w:pPr>
-      <w:rPr/>
-    </w:lvl>
-    <w:lvl w:ilvl="8">
-      <w:start w:val="1"/>
-      <w:numFmt w:val="decimal"/>
-      <w:lvlText w:val="%9."/>
-      <w:lvlJc w:val="left"/>
-      <w:pPr>
-        <w:tabs>
-          <w:tab w:val="num" w:pos="3600"/>
-        </w:tabs>
-        <w:ind w:left="3600" w:hanging="360"/>
-      </w:pPr>
-      <w:rPr/>
-    </w:lvl>
-  </w:abstractNum>
-  <w:abstractNum w:abstractNumId="34">
     <w:lvl w:ilvl="0">
       <w:start w:val="1"/>
       <w:numFmt w:val="none"/>
@@ -13421,130 +13013,79 @@
     <w:abstractNumId w:val="26"/>
   </w:num>
   <w:num w:numId="27">
-    <w:abstractNumId w:val="27"/>
-  </w:num>
-  <w:num w:numId="28">
-    <w:abstractNumId w:val="28"/>
-  </w:num>
-  <w:num w:numId="29">
-    <w:abstractNumId w:val="29"/>
-  </w:num>
-  <w:num w:numId="30">
-    <w:abstractNumId w:val="30"/>
-  </w:num>
-  <w:num w:numId="31">
-    <w:abstractNumId w:val="31"/>
-  </w:num>
-  <w:num w:numId="32">
-    <w:abstractNumId w:val="32"/>
-  </w:num>
-  <w:num w:numId="33">
-    <w:abstractNumId w:val="33"/>
-  </w:num>
-  <w:num w:numId="34">
-    <w:abstractNumId w:val="34"/>
-  </w:num>
-  <w:num w:numId="35">
     <w:abstractNumId w:val="1"/>
     <w:lvlOverride w:ilvl="0">
       <w:startOverride w:val="1"/>
     </w:lvlOverride>
   </w:num>
+  <w:num w:numId="28">
+    <w:abstractNumId w:val="2"/>
+  </w:num>
+  <w:num w:numId="29">
+    <w:abstractNumId w:val="2"/>
+  </w:num>
+  <w:num w:numId="30">
+    <w:abstractNumId w:val="2"/>
+  </w:num>
+  <w:num w:numId="31">
+    <w:abstractNumId w:val="2"/>
+  </w:num>
+  <w:num w:numId="32">
+    <w:abstractNumId w:val="2"/>
+  </w:num>
+  <w:num w:numId="33">
+    <w:abstractNumId w:val="2"/>
+  </w:num>
+  <w:num w:numId="34">
+    <w:abstractNumId w:val="2"/>
+  </w:num>
+  <w:num w:numId="35">
+    <w:abstractNumId w:val="2"/>
+  </w:num>
   <w:num w:numId="36">
-    <w:abstractNumId w:val="1"/>
+    <w:abstractNumId w:val="2"/>
   </w:num>
   <w:num w:numId="37">
-    <w:abstractNumId w:val="1"/>
+    <w:abstractNumId w:val="2"/>
   </w:num>
   <w:num w:numId="38">
-    <w:abstractNumId w:val="1"/>
+    <w:abstractNumId w:val="2"/>
   </w:num>
   <w:num w:numId="39">
-    <w:abstractNumId w:val="1"/>
+    <w:abstractNumId w:val="2"/>
   </w:num>
   <w:num w:numId="40">
-    <w:abstractNumId w:val="1"/>
+    <w:abstractNumId w:val="2"/>
   </w:num>
   <w:num w:numId="41">
-    <w:abstractNumId w:val="1"/>
+    <w:abstractNumId w:val="2"/>
   </w:num>
   <w:num w:numId="42">
-    <w:abstractNumId w:val="1"/>
+    <w:abstractNumId w:val="2"/>
   </w:num>
   <w:num w:numId="43">
-    <w:abstractNumId w:val="1"/>
+    <w:abstractNumId w:val="2"/>
   </w:num>
   <w:num w:numId="44">
-    <w:abstractNumId w:val="1"/>
+    <w:abstractNumId w:val="2"/>
   </w:num>
   <w:num w:numId="45">
-    <w:abstractNumId w:val="1"/>
+    <w:abstractNumId w:val="2"/>
   </w:num>
   <w:num w:numId="46">
-    <w:abstractNumId w:val="1"/>
+    <w:abstractNumId w:val="2"/>
   </w:num>
   <w:num w:numId="47">
-    <w:abstractNumId w:val="1"/>
+    <w:abstractNumId w:val="2"/>
   </w:num>
   <w:num w:numId="48">
-    <w:abstractNumId w:val="1"/>
+    <w:abstractNumId w:val="2"/>
   </w:num>
   <w:num w:numId="49">
-    <w:abstractNumId w:val="1"/>
+    <w:abstractNumId w:val="2"/>
   </w:num>
   <w:num w:numId="50">
-    <w:abstractNumId w:val="1"/>
-  </w:num>
-  <w:num w:numId="51">
-    <w:abstractNumId w:val="1"/>
-  </w:num>
-  <w:num w:numId="52">
-    <w:abstractNumId w:val="1"/>
-  </w:num>
-  <w:num w:numId="53">
-    <w:abstractNumId w:val="1"/>
-  </w:num>
-  <w:num w:numId="54">
-    <w:abstractNumId w:val="1"/>
-  </w:num>
-  <w:num w:numId="55">
-    <w:abstractNumId w:val="1"/>
-  </w:num>
-  <w:num w:numId="56">
-    <w:abstractNumId w:val="1"/>
-  </w:num>
-  <w:num w:numId="57">
-    <w:abstractNumId w:val="1"/>
-  </w:num>
-  <w:num w:numId="58">
-    <w:abstractNumId w:val="1"/>
-  </w:num>
-  <w:num w:numId="59">
-    <w:abstractNumId w:val="1"/>
-  </w:num>
-  <w:num w:numId="60">
-    <w:abstractNumId w:val="1"/>
-  </w:num>
-  <w:num w:numId="61">
-    <w:abstractNumId w:val="1"/>
-  </w:num>
-  <w:num w:numId="62">
-    <w:abstractNumId w:val="1"/>
-  </w:num>
-  <w:num w:numId="63">
-    <w:abstractNumId w:val="1"/>
-  </w:num>
-  <w:num w:numId="64">
-    <w:abstractNumId w:val="1"/>
-  </w:num>
-  <w:num w:numId="65">
-    <w:abstractNumId w:val="1"/>
-  </w:num>
-  <w:num w:numId="66">
-    <w:abstractNumId w:val="1"/>
-  </w:num>
-  <w:num w:numId="67">
-    <w:abstractNumId w:val="1"/>
+    <w:abstractNumId w:val="2"/>
   </w:num>
 </w:numbering>
 </file>

</xml_diff>